<commit_message>
release: adopt updated EN toxicology labels
</commit_message>
<xml_diff>
--- a/MSDS Skill/examples/template_reference_en.docx
+++ b/MSDS Skill/examples/template_reference_en.docx
@@ -5111,6 +5111,7 @@
               <w:pageBreakBefore w:val="0"/>
               <w:widowControl w:val="0"/>
               <w:numPr>
+                <w:ilvl w:val="0"/>
                 <w:numId w:val="0"/>
               </w:numPr>
               <w:kinsoku/>
@@ -5181,6 +5182,7 @@
               <w:pageBreakBefore w:val="0"/>
               <w:widowControl w:val="0"/>
               <w:numPr>
+                <w:ilvl w:val="0"/>
                 <w:numId w:val="0"/>
               </w:numPr>
               <w:kinsoku/>
@@ -12685,9 +12687,9 @@
       </w:tblPr>
       <w:tblGrid>
         <w:gridCol w:w="3519"/>
-        <w:gridCol w:w="1311"/>
-        <w:gridCol w:w="635"/>
-        <w:gridCol w:w="4316"/>
+        <w:gridCol w:w="1924"/>
+        <w:gridCol w:w="75"/>
+        <w:gridCol w:w="4263"/>
       </w:tblGrid>
       <w:tr>
         <w:tblPrEx>
@@ -12976,7 +12978,7 @@
         </w:tc>
         <w:tc>
           <w:tcPr>
-            <w:tcW w:w="1311" w:type="dxa"/>
+            <w:tcW w:w="1924" w:type="dxa"/>
             <w:tcBorders>
               <w:top w:val="dotted" w:color="auto" w:sz="4" w:space="0"/>
               <w:left w:val="dotted" w:color="auto" w:sz="4" w:space="0"/>
@@ -13002,7 +13004,7 @@
               <w:snapToGrid/>
               <w:spacing w:line="300" w:lineRule="auto"/>
               <w:ind w:right="482"/>
-              <w:jc w:val="left"/>
+              <w:jc w:val="both"/>
               <w:textAlignment w:val="auto"/>
               <w:rPr>
                 <w:rFonts w:hint="default" w:ascii="宋体" w:hAnsi="宋体" w:eastAsia="宋体" w:cs="宋体"/>
@@ -13015,19 +13017,17 @@
             </w:pPr>
             <w:r>
               <w:rPr>
-                <w:rFonts w:hint="eastAsia"/>
-                <w:b/>
-                <w:bCs/>
-                <w:sz w:val="24"/>
-                <w:lang w:val="en-US" w:eastAsia="zh-CN"/>
-              </w:rPr>
-              <w:t>经口：</w:t>
-            </w:r>
-          </w:p>
-        </w:tc>
-        <w:tc>
-          <w:tcPr>
-            <w:tcW w:w="4951" w:type="dxa"/>
+                <w:rFonts w:hint="eastAsia" w:hAnsi="Arial"/>
+                <w:b/>
+                <w:sz w:val="24"/>
+              </w:rPr>
+              <w:t>Oral:</w:t>
+            </w:r>
+          </w:p>
+        </w:tc>
+        <w:tc>
+          <w:tcPr>
+            <w:tcW w:w="4338" w:type="dxa"/>
             <w:gridSpan w:val="2"/>
             <w:tcBorders>
               <w:top w:val="dotted" w:color="auto" w:sz="4" w:space="0"/>
@@ -13139,7 +13139,7 @@
         </w:tc>
         <w:tc>
           <w:tcPr>
-            <w:tcW w:w="1311" w:type="dxa"/>
+            <w:tcW w:w="1924" w:type="dxa"/>
             <w:tcBorders>
               <w:top w:val="dotted" w:color="auto" w:sz="4" w:space="0"/>
               <w:left w:val="dotted" w:color="auto" w:sz="4" w:space="0"/>
@@ -13165,7 +13165,7 @@
               <w:snapToGrid/>
               <w:spacing w:line="300" w:lineRule="auto"/>
               <w:ind w:right="482"/>
-              <w:jc w:val="left"/>
+              <w:jc w:val="both"/>
               <w:textAlignment w:val="auto"/>
               <w:rPr>
                 <w:rFonts w:hint="eastAsia"/>
@@ -13177,19 +13177,34 @@
             </w:pPr>
             <w:r>
               <w:rPr>
-                <w:rFonts w:hint="eastAsia"/>
-                <w:b/>
-                <w:bCs/>
+                <w:rFonts w:hint="eastAsia" w:hAnsi="Arial"/>
+                <w:b/>
+                <w:sz w:val="24"/>
+              </w:rPr>
+              <w:t>Inhalatio</w:t>
+            </w:r>
+            <w:r>
+              <w:rPr>
+                <w:rFonts w:hint="eastAsia" w:hAnsi="Arial"/>
+                <w:b/>
                 <w:sz w:val="24"/>
                 <w:lang w:val="en-US" w:eastAsia="zh-CN"/>
               </w:rPr>
-              <w:t>吸入：</w:t>
-            </w:r>
-          </w:p>
-        </w:tc>
-        <w:tc>
-          <w:tcPr>
-            <w:tcW w:w="4951" w:type="dxa"/>
+              <w:t>n</w:t>
+            </w:r>
+            <w:r>
+              <w:rPr>
+                <w:rFonts w:hint="eastAsia" w:hAnsi="Arial"/>
+                <w:b/>
+                <w:sz w:val="24"/>
+              </w:rPr>
+              <w:t>:</w:t>
+            </w:r>
+          </w:p>
+        </w:tc>
+        <w:tc>
+          <w:tcPr>
+            <w:tcW w:w="4338" w:type="dxa"/>
             <w:gridSpan w:val="2"/>
             <w:tcBorders>
               <w:top w:val="dotted" w:color="auto" w:sz="4" w:space="0"/>
@@ -13301,7 +13316,7 @@
         </w:tc>
         <w:tc>
           <w:tcPr>
-            <w:tcW w:w="1311" w:type="dxa"/>
+            <w:tcW w:w="1924" w:type="dxa"/>
             <w:tcBorders>
               <w:top w:val="dotted" w:color="auto" w:sz="4" w:space="0"/>
               <w:left w:val="dotted" w:color="auto" w:sz="4" w:space="0"/>
@@ -13327,7 +13342,7 @@
               <w:snapToGrid/>
               <w:spacing w:line="300" w:lineRule="auto"/>
               <w:ind w:right="482"/>
-              <w:jc w:val="left"/>
+              <w:jc w:val="both"/>
               <w:textAlignment w:val="auto"/>
               <w:rPr>
                 <w:rFonts w:hint="eastAsia"/>
@@ -13339,19 +13354,17 @@
             </w:pPr>
             <w:r>
               <w:rPr>
-                <w:rFonts w:hint="eastAsia"/>
-                <w:b/>
-                <w:bCs/>
-                <w:sz w:val="24"/>
-                <w:lang w:val="en-US" w:eastAsia="zh-CN"/>
-              </w:rPr>
-              <w:t>经皮：</w:t>
-            </w:r>
-          </w:p>
-        </w:tc>
-        <w:tc>
-          <w:tcPr>
-            <w:tcW w:w="4951" w:type="dxa"/>
+                <w:rFonts w:hint="eastAsia" w:hAnsi="Arial"/>
+                <w:b/>
+                <w:sz w:val="24"/>
+              </w:rPr>
+              <w:t>Dermal:</w:t>
+            </w:r>
+          </w:p>
+        </w:tc>
+        <w:tc>
+          <w:tcPr>
+            <w:tcW w:w="4338" w:type="dxa"/>
             <w:gridSpan w:val="2"/>
             <w:tcBorders>
               <w:top w:val="dotted" w:color="auto" w:sz="4" w:space="0"/>
@@ -14529,7 +14542,7 @@
         </w:tc>
         <w:tc>
           <w:tcPr>
-            <w:tcW w:w="1946" w:type="dxa"/>
+            <w:tcW w:w="1999" w:type="dxa"/>
             <w:gridSpan w:val="2"/>
             <w:tcBorders>
               <w:top w:val="dotted" w:color="auto" w:sz="4" w:space="0"/>
@@ -14558,7 +14571,7 @@
               <w:jc w:val="left"/>
               <w:textAlignment w:val="auto"/>
               <w:rPr>
-                <w:rFonts w:hint="default" w:hAnsi="Arial"/>
+                <w:rFonts w:hint="eastAsia" w:hAnsi="Arial" w:eastAsia="宋体"/>
                 <w:b/>
                 <w:bCs/>
                 <w:sz w:val="24"/>
@@ -14567,18 +14580,26 @@
             </w:pPr>
             <w:r>
               <w:rPr>
-                <w:rFonts w:hint="eastAsia" w:ascii="宋体" w:hAnsi="宋体" w:cs="宋体"/>
-                <w:b/>
-                <w:bCs/>
-                <w:sz w:val="24"/>
-              </w:rPr>
-              <w:t>生育力</w:t>
-            </w:r>
-          </w:p>
-        </w:tc>
-        <w:tc>
-          <w:tcPr>
-            <w:tcW w:w="4316" w:type="dxa"/>
+                <w:rFonts w:hint="eastAsia" w:hAnsi="Arial"/>
+                <w:b/>
+                <w:sz w:val="24"/>
+              </w:rPr>
+              <w:t>Fertility</w:t>
+            </w:r>
+            <w:r>
+              <w:rPr>
+                <w:rFonts w:hint="eastAsia" w:hAnsi="Arial"/>
+                <w:b/>
+                <w:sz w:val="24"/>
+                <w:lang w:eastAsia="zh-CN"/>
+              </w:rPr>
+              <w:t>：</w:t>
+            </w:r>
+          </w:p>
+        </w:tc>
+        <w:tc>
+          <w:tcPr>
+            <w:tcW w:w="4263" w:type="dxa"/>
             <w:tcBorders>
               <w:top w:val="dotted" w:color="auto" w:sz="4" w:space="0"/>
               <w:left w:val="dotted" w:color="auto" w:sz="4" w:space="0"/>
@@ -14681,7 +14702,7 @@
         </w:tc>
         <w:tc>
           <w:tcPr>
-            <w:tcW w:w="1946" w:type="dxa"/>
+            <w:tcW w:w="1999" w:type="dxa"/>
             <w:gridSpan w:val="2"/>
             <w:tcBorders>
               <w:top w:val="dotted" w:color="auto" w:sz="4" w:space="0"/>
@@ -14710,27 +14731,36 @@
               <w:jc w:val="left"/>
               <w:textAlignment w:val="auto"/>
               <w:rPr>
-                <w:rFonts w:ascii="宋体" w:hAnsi="宋体" w:eastAsia="宋体" w:cs="宋体"/>
+                <w:rFonts w:hint="eastAsia" w:ascii="宋体" w:hAnsi="宋体" w:eastAsia="宋体" w:cs="宋体"/>
                 <w:b/>
                 <w:bCs/>
                 <w:sz w:val="24"/>
                 <w:szCs w:val="24"/>
-              </w:rPr>
-            </w:pPr>
-            <w:r>
-              <w:rPr>
-                <w:rFonts w:hint="eastAsia" w:ascii="宋体" w:hAnsi="宋体" w:cs="宋体"/>
-                <w:b/>
-                <w:bCs/>
-                <w:sz w:val="24"/>
-              </w:rPr>
-              <w:t>致畸形</w:t>
-            </w:r>
-          </w:p>
-        </w:tc>
-        <w:tc>
-          <w:tcPr>
-            <w:tcW w:w="4316" w:type="dxa"/>
+                <w:lang w:eastAsia="zh-CN"/>
+              </w:rPr>
+            </w:pPr>
+            <w:r>
+              <w:rPr>
+                <w:rFonts w:hint="eastAsia" w:hAnsi="Arial"/>
+                <w:b/>
+                <w:sz w:val="24"/>
+              </w:rPr>
+              <w:t>Teratogenicity</w:t>
+            </w:r>
+            <w:r>
+              <w:rPr>
+                <w:rFonts w:hint="eastAsia" w:hAnsi="Arial"/>
+                <w:b/>
+                <w:sz w:val="24"/>
+                <w:lang w:eastAsia="zh-CN"/>
+              </w:rPr>
+              <w:t>：</w:t>
+            </w:r>
+          </w:p>
+        </w:tc>
+        <w:tc>
+          <w:tcPr>
+            <w:tcW w:w="4263" w:type="dxa"/>
             <w:tcBorders>
               <w:top w:val="dotted" w:color="auto" w:sz="4" w:space="0"/>
               <w:left w:val="dotted" w:color="auto" w:sz="4" w:space="0"/>
@@ -14833,7 +14863,7 @@
         </w:tc>
         <w:tc>
           <w:tcPr>
-            <w:tcW w:w="1946" w:type="dxa"/>
+            <w:tcW w:w="1999" w:type="dxa"/>
             <w:gridSpan w:val="2"/>
             <w:tcBorders>
               <w:top w:val="dotted" w:color="auto" w:sz="4" w:space="0"/>
@@ -14861,26 +14891,37 @@
               <w:jc w:val="left"/>
               <w:textAlignment w:val="auto"/>
               <w:rPr>
-                <w:rFonts w:hint="eastAsia" w:ascii="宋体" w:hAnsi="宋体" w:cs="宋体"/>
+                <w:rFonts w:hint="eastAsia" w:ascii="宋体" w:hAnsi="宋体" w:eastAsia="宋体" w:cs="宋体"/>
                 <w:b/>
                 <w:bCs/>
                 <w:sz w:val="24"/>
-              </w:rPr>
-            </w:pPr>
-            <w:r>
-              <w:rPr>
-                <w:rFonts w:hint="eastAsia" w:ascii="宋体" w:hAnsi="宋体" w:cs="宋体"/>
-                <w:b/>
-                <w:bCs/>
-                <w:sz w:val="24"/>
-              </w:rPr>
-              <w:t>体外遗传毒性</w:t>
-            </w:r>
-          </w:p>
-        </w:tc>
-        <w:tc>
-          <w:tcPr>
-            <w:tcW w:w="4316" w:type="dxa"/>
+                <w:lang w:eastAsia="zh-CN"/>
+              </w:rPr>
+            </w:pPr>
+            <w:r>
+              <w:rPr>
+                <w:rFonts w:hint="eastAsia" w:hAnsi="Arial"/>
+                <w:b/>
+                <w:sz w:val="24"/>
+              </w:rPr>
+              <w:t>In vitro genotoxicity</w:t>
+            </w:r>
+            <w:r>
+              <w:rPr>
+                <w:rFonts w:hint="eastAsia" w:hAnsi="Arial"/>
+                <w:b/>
+                <w:sz w:val="24"/>
+                <w:lang w:eastAsia="zh-CN"/>
+              </w:rPr>
+              <w:t>：</w:t>
+            </w:r>
+            <w:bookmarkStart w:id="0" w:name="_GoBack"/>
+            <w:bookmarkEnd w:id="0"/>
+          </w:p>
+        </w:tc>
+        <w:tc>
+          <w:tcPr>
+            <w:tcW w:w="4263" w:type="dxa"/>
             <w:tcBorders>
               <w:top w:val="dotted" w:color="auto" w:sz="4" w:space="0"/>
               <w:left w:val="dotted" w:color="auto" w:sz="4" w:space="0"/>
@@ -17817,19 +17858,7 @@
                 <w:kern w:val="0"/>
                 <w:sz w:val="24"/>
               </w:rPr>
-              <w:t>Complies with the following regula</w:t>
-            </w:r>
-            <w:bookmarkStart w:id="0" w:name="_GoBack"/>
-            <w:bookmarkEnd w:id="0"/>
-            <w:r>
-              <w:rPr>
-                <w:rFonts w:hint="eastAsia" w:cs="Arial"/>
-                <w:b/>
-                <w:bCs/>
-                <w:kern w:val="0"/>
-                <w:sz w:val="24"/>
-              </w:rPr>
-              <w:t>tions：</w:t>
+              <w:t>Complies with the following regulations：</w:t>
             </w:r>
           </w:p>
         </w:tc>

</xml_diff>

<commit_message>
release MSDS Skill v3.15.1
</commit_message>
<xml_diff>
--- a/MSDS Skill/examples/template_reference_en.docx
+++ b/MSDS Skill/examples/template_reference_en.docx
@@ -7379,22 +7379,6 @@
                 <w:sz w:val="24"/>
               </w:rPr>
               <w:t>Hand protection：</w:t>
-            </w:r>
-            <w:r>
-              <w:rPr>
-                <w:b/>
-                <w:sz w:val="24"/>
-              </w:rPr>
-              <w:tab/>
-            </w:r>
-            <w:r>
-              <w:rPr>
-                <w:rFonts w:hint="eastAsia" w:hAnsi="Arial" w:cs="Arial"/>
-                <w:b/>
-                <w:kern w:val="0"/>
-                <w:sz w:val="24"/>
-              </w:rPr>
-              <w:t>喷涂过程中要求有呼吸防护设备。</w:t>
             </w:r>
           </w:p>
         </w:tc>

</xml_diff>

<commit_message>
feat(msds): publish unified standardizer v3.20.0
</commit_message>
<xml_diff>
--- a/MSDS Skill/examples/template_reference_en.docx
+++ b/MSDS Skill/examples/template_reference_en.docx
@@ -1170,6 +1170,7 @@
           </w:tblCellMar>
         </w:tblPrEx>
         <w:trPr>
+          <w:cantSplit/>
           <w:tblHeader/>
         </w:trPr>
         <w:tc>
@@ -5988,6 +5989,7 @@
           </w:tblCellMar>
         </w:tblPrEx>
         <w:trPr>
+          <w:cantSplit/>
           <w:tblHeader/>
         </w:trPr>
         <w:tc>
@@ -6053,6 +6055,7 @@
           </w:tblCellMar>
         </w:tblPrEx>
         <w:trPr>
+          <w:cantSplit/>
           <w:trHeight w:val="578" w:hRule="atLeast"/>
         </w:trPr>
         <w:tc>
@@ -6273,6 +6276,7 @@
           </w:tblCellMar>
         </w:tblPrEx>
         <w:trPr>
+          <w:cantSplit/>
           <w:trHeight w:val="270" w:hRule="atLeast"/>
         </w:trPr>
         <w:tc>
@@ -7082,9 +7086,10 @@
             <w:tcW w:w="9860" w:type="dxa"/>
             <w:gridSpan w:val="5"/>
             <w:tcBorders>
-              <w:bottom w:val="single" w:color="auto" w:sz="4" w:space="0"/>
-              <w:tl2br w:val="nil"/>
-              <w:tr2bl w:val="nil"/>
+              <w:top w:val="single" w:color="auto" w:sz="4" w:space="0"/>
+              <w:left w:val="single" w:color="auto" w:sz="4" w:space="0"/>
+              <w:bottom w:val="dotted" w:color="auto" w:sz="4" w:space="0"/>
+              <w:right w:val="single" w:color="auto" w:sz="4" w:space="0"/>
             </w:tcBorders>
             <w:shd w:val="clear" w:color="auto" w:fill="D9D9D9"/>
           </w:tcPr>
@@ -7148,9 +7153,9 @@
             <w:tcW w:w="9860" w:type="dxa"/>
             <w:gridSpan w:val="5"/>
             <w:tcBorders>
-              <w:top w:val="single" w:color="auto" w:sz="4" w:space="0"/>
+              <w:top w:val="dotted" w:color="auto" w:sz="4" w:space="0"/>
               <w:left w:val="single" w:color="auto" w:sz="4" w:space="0"/>
-              <w:bottom w:val="single" w:color="auto" w:sz="4" w:space="0"/>
+              <w:bottom w:val="dotted" w:color="auto" w:sz="4" w:space="0"/>
               <w:right w:val="single" w:color="auto" w:sz="4" w:space="0"/>
             </w:tcBorders>
             <w:vAlign w:val="center"/>
@@ -7226,7 +7231,7 @@
             <w:tcW w:w="3247" w:type="dxa"/>
             <w:gridSpan w:val="2"/>
             <w:tcBorders>
-              <w:top w:val="single" w:color="auto" w:sz="4" w:space="0"/>
+              <w:top w:val="dotted" w:color="auto" w:sz="4" w:space="0"/>
               <w:left w:val="single" w:color="auto" w:sz="4" w:space="0"/>
               <w:bottom w:val="dotted" w:color="auto" w:sz="4" w:space="0"/>
               <w:right w:val="dotted" w:color="auto" w:sz="4" w:space="0"/>
@@ -7270,7 +7275,7 @@
             <w:tcW w:w="6613" w:type="dxa"/>
             <w:gridSpan w:val="3"/>
             <w:tcBorders>
-              <w:top w:val="single" w:color="auto" w:sz="4" w:space="0"/>
+              <w:top w:val="dotted" w:color="auto" w:sz="4" w:space="0"/>
               <w:left w:val="dotted" w:color="auto" w:sz="4" w:space="0"/>
               <w:bottom w:val="dotted" w:color="auto" w:sz="4" w:space="0"/>
               <w:right w:val="single" w:color="auto" w:sz="4" w:space="0"/>
@@ -7376,6 +7381,22 @@
               </w:rPr>
               <w:t>Hand protection：</w:t>
             </w:r>
+            <w:r>
+              <w:rPr>
+                <w:b/>
+                <w:sz w:val="24"/>
+              </w:rPr>
+              <w:tab/>
+            </w:r>
+            <w:r>
+              <w:rPr>
+                <w:rFonts w:hint="eastAsia" w:hAnsi="Arial" w:cs="Arial"/>
+                <w:b/>
+                <w:kern w:val="0"/>
+                <w:sz w:val="24"/>
+              </w:rPr>
+              <w:t>喷涂过程中要求有呼吸防护设备。</w:t>
+            </w:r>
           </w:p>
         </w:tc>
         <w:tc>
@@ -8434,10 +8455,10 @@
             <w:tcBorders>
               <w:top w:val="dotted" w:color="auto" w:sz="4" w:space="0"/>
               <w:left w:val="single" w:color="auto" w:sz="4" w:space="0"/>
-              <w:bottom w:val="single" w:color="auto" w:sz="4" w:space="0"/>
+              <w:bottom w:val="dotted" w:color="auto" w:sz="4" w:space="0"/>
               <w:right w:val="single" w:color="auto" w:sz="4" w:space="0"/>
             </w:tcBorders>
-            <w:shd w:val="clear"/>
+            <w:shd w:val="clear" w:color="auto" w:fill="auto"/>
             <w:vAlign w:val="center"/>
           </w:tcPr>
           <w:p>
@@ -8471,6 +8492,8 @@
               </w:rPr>
               <w:t>Control parameters for workplace components</w:t>
             </w:r>
+            <w:bookmarkStart w:id="0" w:name="_GoBack"/>
+            <w:bookmarkEnd w:id="0"/>
           </w:p>
         </w:tc>
       </w:tr>
@@ -8500,10 +8523,10 @@
             <w:tcBorders>
               <w:top w:val="dotted" w:color="auto" w:sz="4" w:space="0"/>
               <w:left w:val="single" w:color="auto" w:sz="4" w:space="0"/>
-              <w:bottom w:val="single" w:color="auto" w:sz="4" w:space="0"/>
-              <w:right w:val="single" w:color="auto" w:sz="4" w:space="0"/>
-            </w:tcBorders>
-            <w:shd w:val="clear"/>
+              <w:bottom w:val="dotted" w:color="auto" w:sz="4" w:space="0"/>
+              <w:right w:val="dotted" w:color="auto" w:sz="4" w:space="0"/>
+            </w:tcBorders>
+            <w:shd w:val="clear" w:color="auto" w:fill="auto"/>
             <w:vAlign w:val="center"/>
           </w:tcPr>
           <w:p>
@@ -8529,7 +8552,6 @@
                 <w:lang w:val="en-US" w:eastAsia="zh-CN"/>
               </w:rPr>
             </w:pPr>
-            <w:bookmarkStart w:id="0" w:name="_GoBack" w:colFirst="0" w:colLast="3"/>
             <w:r>
               <w:rPr>
                 <w:rFonts w:hint="eastAsia" w:hAnsi="Arial"/>
@@ -8547,11 +8569,103 @@
             <w:gridSpan w:val="2"/>
             <w:tcBorders>
               <w:top w:val="dotted" w:color="auto" w:sz="4" w:space="0"/>
-              <w:left w:val="single" w:color="auto" w:sz="4" w:space="0"/>
-              <w:bottom w:val="single" w:color="auto" w:sz="4" w:space="0"/>
+              <w:left w:val="dotted" w:color="auto" w:sz="4" w:space="0"/>
+              <w:bottom w:val="dotted" w:color="auto" w:sz="4" w:space="0"/>
+              <w:right w:val="dotted" w:color="auto" w:sz="4" w:space="0"/>
+            </w:tcBorders>
+            <w:shd w:val="clear" w:color="auto" w:fill="auto"/>
+            <w:vAlign w:val="center"/>
+          </w:tcPr>
+          <w:p>
+            <w:pPr>
+              <w:keepNext w:val="0"/>
+              <w:keepLines w:val="0"/>
+              <w:pageBreakBefore w:val="0"/>
+              <w:widowControl w:val="0"/>
+              <w:kinsoku/>
+              <w:wordWrap/>
+              <w:overflowPunct/>
+              <w:topLinePunct w:val="0"/>
+              <w:bidi w:val="0"/>
+              <w:adjustRightInd/>
+              <w:snapToGrid/>
+              <w:spacing w:line="300" w:lineRule="auto"/>
+              <w:jc w:val="left"/>
+              <w:textAlignment w:val="auto"/>
+              <w:rPr>
+                <w:rFonts w:hint="eastAsia" w:hAnsi="Arial"/>
+                <w:b/>
+                <w:sz w:val="24"/>
+                <w:lang w:val="en-US" w:eastAsia="zh-CN"/>
+              </w:rPr>
+            </w:pPr>
+            <w:r>
+              <w:rPr>
+                <w:rFonts w:hint="eastAsia" w:hAnsi="Arial"/>
+                <w:b/>
+                <w:sz w:val="24"/>
+                <w:lang w:val="en-US" w:eastAsia="zh-CN"/>
+              </w:rPr>
+              <w:t>Basis</w:t>
+            </w:r>
+          </w:p>
+        </w:tc>
+        <w:tc>
+          <w:tcPr>
+            <w:tcW w:w="2465" w:type="dxa"/>
+            <w:tcBorders>
+              <w:top w:val="dotted" w:color="auto" w:sz="4" w:space="0"/>
+              <w:left w:val="dotted" w:color="auto" w:sz="4" w:space="0"/>
+              <w:bottom w:val="dotted" w:color="auto" w:sz="4" w:space="0"/>
+              <w:right w:val="dotted" w:color="auto" w:sz="4" w:space="0"/>
+            </w:tcBorders>
+            <w:shd w:val="clear" w:color="auto" w:fill="auto"/>
+            <w:vAlign w:val="center"/>
+          </w:tcPr>
+          <w:p>
+            <w:pPr>
+              <w:keepNext w:val="0"/>
+              <w:keepLines w:val="0"/>
+              <w:pageBreakBefore w:val="0"/>
+              <w:widowControl w:val="0"/>
+              <w:kinsoku/>
+              <w:wordWrap/>
+              <w:overflowPunct/>
+              <w:topLinePunct w:val="0"/>
+              <w:bidi w:val="0"/>
+              <w:adjustRightInd/>
+              <w:snapToGrid/>
+              <w:spacing w:line="300" w:lineRule="auto"/>
+              <w:jc w:val="left"/>
+              <w:textAlignment w:val="auto"/>
+              <w:rPr>
+                <w:rFonts w:hint="eastAsia" w:hAnsi="Arial"/>
+                <w:b/>
+                <w:sz w:val="24"/>
+                <w:lang w:val="en-US" w:eastAsia="zh-CN"/>
+              </w:rPr>
+            </w:pPr>
+            <w:r>
+              <w:rPr>
+                <w:rFonts w:hint="eastAsia" w:hAnsi="Arial"/>
+                <w:b/>
+                <w:sz w:val="24"/>
+                <w:lang w:val="en-US" w:eastAsia="zh-CN"/>
+              </w:rPr>
+              <w:t>Type</w:t>
+            </w:r>
+          </w:p>
+        </w:tc>
+        <w:tc>
+          <w:tcPr>
+            <w:tcW w:w="2465" w:type="dxa"/>
+            <w:tcBorders>
+              <w:top w:val="dotted" w:color="auto" w:sz="4" w:space="0"/>
+              <w:left w:val="dotted" w:color="auto" w:sz="4" w:space="0"/>
+              <w:bottom w:val="dotted" w:color="auto" w:sz="4" w:space="0"/>
               <w:right w:val="single" w:color="auto" w:sz="4" w:space="0"/>
             </w:tcBorders>
-            <w:shd w:val="clear"/>
+            <w:shd w:val="clear" w:color="auto" w:fill="auto"/>
             <w:vAlign w:val="center"/>
           </w:tcPr>
           <w:p>
@@ -8584,315 +8698,7 @@
                 <w:sz w:val="24"/>
                 <w:lang w:val="en-US" w:eastAsia="zh-CN"/>
               </w:rPr>
-              <w:t>Basis</w:t>
-            </w:r>
-          </w:p>
-        </w:tc>
-        <w:tc>
-          <w:tcPr>
-            <w:tcW w:w="2465" w:type="dxa"/>
-            <w:tcBorders>
-              <w:top w:val="dotted" w:color="auto" w:sz="4" w:space="0"/>
-              <w:left w:val="single" w:color="auto" w:sz="4" w:space="0"/>
-              <w:bottom w:val="single" w:color="auto" w:sz="4" w:space="0"/>
-              <w:right w:val="single" w:color="auto" w:sz="4" w:space="0"/>
-            </w:tcBorders>
-            <w:shd w:val="clear"/>
-            <w:vAlign w:val="center"/>
-          </w:tcPr>
-          <w:p>
-            <w:pPr>
-              <w:keepNext w:val="0"/>
-              <w:keepLines w:val="0"/>
-              <w:pageBreakBefore w:val="0"/>
-              <w:widowControl w:val="0"/>
-              <w:kinsoku/>
-              <w:wordWrap/>
-              <w:overflowPunct/>
-              <w:topLinePunct w:val="0"/>
-              <w:bidi w:val="0"/>
-              <w:adjustRightInd/>
-              <w:snapToGrid/>
-              <w:spacing w:line="300" w:lineRule="auto"/>
-              <w:jc w:val="left"/>
-              <w:textAlignment w:val="auto"/>
-              <w:rPr>
-                <w:rFonts w:hint="eastAsia" w:hAnsi="Arial"/>
-                <w:b/>
-                <w:sz w:val="24"/>
-                <w:lang w:val="en-US" w:eastAsia="zh-CN"/>
-              </w:rPr>
-            </w:pPr>
-            <w:r>
-              <w:rPr>
-                <w:rFonts w:hint="eastAsia" w:hAnsi="Arial"/>
-                <w:b/>
-                <w:sz w:val="24"/>
-                <w:lang w:val="en-US" w:eastAsia="zh-CN"/>
-              </w:rPr>
-              <w:t>Type</w:t>
-            </w:r>
-          </w:p>
-        </w:tc>
-        <w:tc>
-          <w:tcPr>
-            <w:tcW w:w="2465" w:type="dxa"/>
-            <w:tcBorders>
-              <w:top w:val="dotted" w:color="auto" w:sz="4" w:space="0"/>
-              <w:left w:val="single" w:color="auto" w:sz="4" w:space="0"/>
-              <w:bottom w:val="single" w:color="auto" w:sz="4" w:space="0"/>
-              <w:right w:val="single" w:color="auto" w:sz="4" w:space="0"/>
-            </w:tcBorders>
-            <w:shd w:val="clear"/>
-            <w:vAlign w:val="center"/>
-          </w:tcPr>
-          <w:p>
-            <w:pPr>
-              <w:keepNext w:val="0"/>
-              <w:keepLines w:val="0"/>
-              <w:pageBreakBefore w:val="0"/>
-              <w:widowControl w:val="0"/>
-              <w:kinsoku/>
-              <w:wordWrap/>
-              <w:overflowPunct/>
-              <w:topLinePunct w:val="0"/>
-              <w:bidi w:val="0"/>
-              <w:adjustRightInd/>
-              <w:snapToGrid/>
-              <w:spacing w:line="300" w:lineRule="auto"/>
-              <w:jc w:val="left"/>
-              <w:textAlignment w:val="auto"/>
-              <w:rPr>
-                <w:rFonts w:hint="eastAsia" w:hAnsi="Arial"/>
-                <w:b/>
-                <w:sz w:val="24"/>
-                <w:lang w:val="en-US" w:eastAsia="zh-CN"/>
-              </w:rPr>
-            </w:pPr>
-            <w:r>
-              <w:rPr>
-                <w:rFonts w:hint="eastAsia" w:hAnsi="Arial"/>
-                <w:b/>
-                <w:sz w:val="24"/>
-                <w:lang w:val="en-US" w:eastAsia="zh-CN"/>
-              </w:rPr>
               <w:t>Value</w:t>
-            </w:r>
-          </w:p>
-        </w:tc>
-      </w:tr>
-      <w:bookmarkEnd w:id="0"/>
-      <w:tr>
-        <w:tblPrEx>
-          <w:tblBorders>
-            <w:top w:val="dotted" w:color="auto" w:sz="4" w:space="0"/>
-            <w:left w:val="dotted" w:color="auto" w:sz="4" w:space="0"/>
-            <w:bottom w:val="dotted" w:color="auto" w:sz="4" w:space="0"/>
-            <w:right w:val="dotted" w:color="auto" w:sz="4" w:space="0"/>
-            <w:insideH w:val="none" w:color="auto" w:sz="0" w:space="0"/>
-            <w:insideV w:val="none" w:color="auto" w:sz="0" w:space="0"/>
-          </w:tblBorders>
-          <w:tblCellMar>
-            <w:top w:w="0" w:type="dxa"/>
-            <w:left w:w="108" w:type="dxa"/>
-            <w:bottom w:w="0" w:type="dxa"/>
-            <w:right w:w="108" w:type="dxa"/>
-          </w:tblCellMar>
-        </w:tblPrEx>
-        <w:trPr>
-          <w:trHeight w:val="244" w:hRule="atLeast"/>
-        </w:trPr>
-        <w:tc>
-          <w:tcPr>
-            <w:tcW w:w="3076" w:type="dxa"/>
-            <w:tcBorders>
-              <w:top w:val="dotted" w:color="auto" w:sz="4" w:space="0"/>
-              <w:left w:val="single" w:color="auto" w:sz="4" w:space="0"/>
-              <w:bottom w:val="dotted" w:color="auto" w:sz="4" w:space="0"/>
-              <w:right w:val="single" w:color="auto" w:sz="4" w:space="0"/>
-            </w:tcBorders>
-            <w:shd w:val="clear" w:color="auto" w:fill="auto"/>
-            <w:vAlign w:val="top"/>
-          </w:tcPr>
-          <w:p>
-            <w:pPr>
-              <w:spacing w:line="300" w:lineRule="auto"/>
-              <w:rPr>
-                <w:rFonts w:hint="eastAsia" w:ascii="Times New Roman" w:hAnsi="Times New Roman" w:eastAsia="宋体" w:cs="Times New Roman"/>
-                <w:kern w:val="2"/>
-                <w:sz w:val="24"/>
-                <w:szCs w:val="24"/>
-                <w:lang w:val="en-US" w:eastAsia="zh-CN" w:bidi="ar-SA"/>
-              </w:rPr>
-            </w:pPr>
-            <w:r>
-              <w:rPr>
-                <w:rFonts w:hint="eastAsia"/>
-                <w:sz w:val="24"/>
-              </w:rPr>
-              <w:t>六亚甲基-</w:t>
-            </w:r>
-            <w:r>
-              <w:rPr>
-                <w:sz w:val="24"/>
-              </w:rPr>
-              <w:t>1</w:t>
-            </w:r>
-            <w:r>
-              <w:rPr>
-                <w:rFonts w:hint="eastAsia"/>
-                <w:sz w:val="24"/>
-              </w:rPr>
-              <w:t>,</w:t>
-            </w:r>
-            <w:r>
-              <w:rPr>
-                <w:sz w:val="24"/>
-              </w:rPr>
-              <w:t>6</w:t>
-            </w:r>
-            <w:r>
-              <w:rPr>
-                <w:rFonts w:hint="eastAsia"/>
-                <w:sz w:val="24"/>
-              </w:rPr>
-              <w:t>-二异氰酸酯</w:t>
-            </w:r>
-          </w:p>
-        </w:tc>
-        <w:tc>
-          <w:tcPr>
-            <w:tcW w:w="1854" w:type="dxa"/>
-            <w:gridSpan w:val="2"/>
-            <w:tcBorders>
-              <w:top w:val="dotted" w:color="auto" w:sz="4" w:space="0"/>
-              <w:left w:val="single" w:color="auto" w:sz="4" w:space="0"/>
-              <w:bottom w:val="dotted" w:color="auto" w:sz="4" w:space="0"/>
-              <w:right w:val="single" w:color="auto" w:sz="4" w:space="0"/>
-            </w:tcBorders>
-            <w:shd w:val="clear" w:color="auto" w:fill="auto"/>
-            <w:vAlign w:val="top"/>
-          </w:tcPr>
-          <w:p>
-            <w:pPr>
-              <w:spacing w:line="300" w:lineRule="auto"/>
-              <w:rPr>
-                <w:rFonts w:hint="eastAsia" w:ascii="Times New Roman" w:hAnsi="Times New Roman" w:eastAsia="宋体" w:cs="Times New Roman"/>
-                <w:kern w:val="2"/>
-                <w:sz w:val="24"/>
-                <w:szCs w:val="24"/>
-                <w:lang w:val="en-US" w:eastAsia="zh-CN" w:bidi="ar-SA"/>
-              </w:rPr>
-            </w:pPr>
-            <w:r>
-              <w:rPr>
-                <w:rFonts w:hint="eastAsia"/>
-                <w:sz w:val="24"/>
-              </w:rPr>
-              <w:t>CN</w:t>
-            </w:r>
-            <w:r>
-              <w:rPr>
-                <w:sz w:val="24"/>
-              </w:rPr>
-              <w:t xml:space="preserve"> </w:t>
-            </w:r>
-            <w:r>
-              <w:rPr>
-                <w:rFonts w:hint="eastAsia"/>
-                <w:sz w:val="24"/>
-              </w:rPr>
-              <w:t>OEL</w:t>
-            </w:r>
-          </w:p>
-        </w:tc>
-        <w:tc>
-          <w:tcPr>
-            <w:tcW w:w="2465" w:type="dxa"/>
-            <w:tcBorders>
-              <w:top w:val="dotted" w:color="auto" w:sz="4" w:space="0"/>
-              <w:left w:val="single" w:color="auto" w:sz="4" w:space="0"/>
-              <w:bottom w:val="dotted" w:color="auto" w:sz="4" w:space="0"/>
-              <w:right w:val="single" w:color="auto" w:sz="4" w:space="0"/>
-            </w:tcBorders>
-            <w:shd w:val="clear" w:color="auto" w:fill="auto"/>
-            <w:vAlign w:val="top"/>
-          </w:tcPr>
-          <w:p>
-            <w:pPr>
-              <w:spacing w:line="300" w:lineRule="auto"/>
-              <w:rPr>
-                <w:rFonts w:hint="eastAsia" w:ascii="Times New Roman" w:hAnsi="Times New Roman" w:eastAsia="宋体" w:cs="Times New Roman"/>
-                <w:kern w:val="2"/>
-                <w:sz w:val="24"/>
-                <w:szCs w:val="24"/>
-                <w:lang w:val="en-US" w:eastAsia="zh-CN" w:bidi="ar-SA"/>
-              </w:rPr>
-            </w:pPr>
-            <w:r>
-              <w:rPr>
-                <w:rFonts w:hint="eastAsia"/>
-                <w:sz w:val="24"/>
-              </w:rPr>
-              <w:t>TWA</w:t>
-            </w:r>
-          </w:p>
-        </w:tc>
-        <w:tc>
-          <w:tcPr>
-            <w:tcW w:w="2465" w:type="dxa"/>
-            <w:tcBorders>
-              <w:top w:val="dotted" w:color="auto" w:sz="4" w:space="0"/>
-              <w:left w:val="single" w:color="auto" w:sz="4" w:space="0"/>
-              <w:bottom w:val="dotted" w:color="auto" w:sz="4" w:space="0"/>
-              <w:right w:val="single" w:color="auto" w:sz="4" w:space="0"/>
-            </w:tcBorders>
-            <w:shd w:val="clear" w:color="auto" w:fill="auto"/>
-            <w:vAlign w:val="top"/>
-          </w:tcPr>
-          <w:p>
-            <w:pPr>
-              <w:spacing w:line="300" w:lineRule="auto"/>
-              <w:rPr>
-                <w:rFonts w:hint="eastAsia" w:ascii="Times New Roman" w:hAnsi="Times New Roman" w:eastAsia="宋体" w:cs="Times New Roman"/>
-                <w:kern w:val="2"/>
-                <w:sz w:val="24"/>
-                <w:szCs w:val="24"/>
-                <w:lang w:val="en-US" w:eastAsia="zh-CN" w:bidi="ar-SA"/>
-              </w:rPr>
-            </w:pPr>
-            <w:r>
-              <w:rPr>
-                <w:rFonts w:hint="eastAsia"/>
-                <w:sz w:val="24"/>
-              </w:rPr>
-              <w:t>0</w:t>
-            </w:r>
-            <w:r>
-              <w:rPr>
-                <w:sz w:val="24"/>
-              </w:rPr>
-              <w:t xml:space="preserve">.03 </w:t>
-            </w:r>
-            <w:r>
-              <w:rPr>
-                <w:rFonts w:hint="eastAsia"/>
-                <w:sz w:val="24"/>
-              </w:rPr>
-              <w:t>mg</w:t>
-            </w:r>
-            <w:r>
-              <w:rPr>
-                <w:sz w:val="24"/>
-              </w:rPr>
-              <w:t>/m</w:t>
-            </w:r>
-            <w:r>
-              <w:rPr>
-                <w:sz w:val="24"/>
-                <w:vertAlign w:val="superscript"/>
-              </w:rPr>
-              <w:t>3</w:t>
             </w:r>
           </w:p>
         </w:tc>
@@ -8924,7 +8730,7 @@
               <w:top w:val="dotted" w:color="auto" w:sz="4" w:space="0"/>
               <w:left w:val="single" w:color="auto" w:sz="4" w:space="0"/>
               <w:bottom w:val="dotted" w:color="auto" w:sz="4" w:space="0"/>
-              <w:right w:val="single" w:color="auto" w:sz="4" w:space="0"/>
+              <w:right w:val="dotted" w:color="auto" w:sz="4" w:space="0"/>
             </w:tcBorders>
             <w:shd w:val="clear" w:color="auto" w:fill="auto"/>
             <w:vAlign w:val="top"/>
@@ -8945,7 +8751,33 @@
                 <w:rFonts w:hint="eastAsia"/>
                 <w:sz w:val="24"/>
               </w:rPr>
-              <w:t>丙二醇甲醚醋酸酯</w:t>
+              <w:t>六亚甲基-</w:t>
+            </w:r>
+            <w:r>
+              <w:rPr>
+                <w:sz w:val="24"/>
+              </w:rPr>
+              <w:t>1</w:t>
+            </w:r>
+            <w:r>
+              <w:rPr>
+                <w:rFonts w:hint="eastAsia"/>
+                <w:sz w:val="24"/>
+              </w:rPr>
+              <w:t>,</w:t>
+            </w:r>
+            <w:r>
+              <w:rPr>
+                <w:sz w:val="24"/>
+              </w:rPr>
+              <w:t>6</w:t>
+            </w:r>
+            <w:r>
+              <w:rPr>
+                <w:rFonts w:hint="eastAsia"/>
+                <w:sz w:val="24"/>
+              </w:rPr>
+              <w:t>-二异氰酸酯</w:t>
             </w:r>
           </w:p>
         </w:tc>
@@ -8955,9 +8787,9 @@
             <w:gridSpan w:val="2"/>
             <w:tcBorders>
               <w:top w:val="dotted" w:color="auto" w:sz="4" w:space="0"/>
-              <w:left w:val="single" w:color="auto" w:sz="4" w:space="0"/>
-              <w:bottom w:val="dotted" w:color="auto" w:sz="4" w:space="0"/>
-              <w:right w:val="single" w:color="auto" w:sz="4" w:space="0"/>
+              <w:left w:val="dotted" w:color="auto" w:sz="4" w:space="0"/>
+              <w:bottom w:val="dotted" w:color="auto" w:sz="4" w:space="0"/>
+              <w:right w:val="dotted" w:color="auto" w:sz="4" w:space="0"/>
             </w:tcBorders>
             <w:shd w:val="clear" w:color="auto" w:fill="auto"/>
             <w:vAlign w:val="top"/>
@@ -9000,9 +8832,9 @@
             <w:tcW w:w="2465" w:type="dxa"/>
             <w:tcBorders>
               <w:top w:val="dotted" w:color="auto" w:sz="4" w:space="0"/>
-              <w:left w:val="single" w:color="auto" w:sz="4" w:space="0"/>
-              <w:bottom w:val="dotted" w:color="auto" w:sz="4" w:space="0"/>
-              <w:right w:val="single" w:color="auto" w:sz="4" w:space="0"/>
+              <w:left w:val="dotted" w:color="auto" w:sz="4" w:space="0"/>
+              <w:bottom w:val="dotted" w:color="auto" w:sz="4" w:space="0"/>
+              <w:right w:val="dotted" w:color="auto" w:sz="4" w:space="0"/>
             </w:tcBorders>
             <w:shd w:val="clear" w:color="auto" w:fill="auto"/>
             <w:vAlign w:val="top"/>
@@ -9032,8 +8864,197 @@
             <w:tcW w:w="2465" w:type="dxa"/>
             <w:tcBorders>
               <w:top w:val="dotted" w:color="auto" w:sz="4" w:space="0"/>
+              <w:left w:val="dotted" w:color="auto" w:sz="4" w:space="0"/>
+              <w:bottom w:val="dotted" w:color="auto" w:sz="4" w:space="0"/>
+              <w:right w:val="single" w:color="auto" w:sz="4" w:space="0"/>
+            </w:tcBorders>
+            <w:shd w:val="clear" w:color="auto" w:fill="auto"/>
+            <w:vAlign w:val="top"/>
+          </w:tcPr>
+          <w:p>
+            <w:pPr>
+              <w:spacing w:line="300" w:lineRule="auto"/>
+              <w:rPr>
+                <w:rFonts w:hint="eastAsia" w:ascii="Times New Roman" w:hAnsi="Times New Roman" w:eastAsia="宋体" w:cs="Times New Roman"/>
+                <w:kern w:val="2"/>
+                <w:sz w:val="24"/>
+                <w:szCs w:val="24"/>
+                <w:lang w:val="en-US" w:eastAsia="zh-CN" w:bidi="ar-SA"/>
+              </w:rPr>
+            </w:pPr>
+            <w:r>
+              <w:rPr>
+                <w:rFonts w:hint="eastAsia"/>
+                <w:sz w:val="24"/>
+              </w:rPr>
+              <w:t>0</w:t>
+            </w:r>
+            <w:r>
+              <w:rPr>
+                <w:sz w:val="24"/>
+              </w:rPr>
+              <w:t xml:space="preserve">.03 </w:t>
+            </w:r>
+            <w:r>
+              <w:rPr>
+                <w:rFonts w:hint="eastAsia"/>
+                <w:sz w:val="24"/>
+              </w:rPr>
+              <w:t>mg</w:t>
+            </w:r>
+            <w:r>
+              <w:rPr>
+                <w:sz w:val="24"/>
+              </w:rPr>
+              <w:t>/m</w:t>
+            </w:r>
+            <w:r>
+              <w:rPr>
+                <w:sz w:val="24"/>
+                <w:vertAlign w:val="superscript"/>
+              </w:rPr>
+              <w:t>3</w:t>
+            </w:r>
+          </w:p>
+        </w:tc>
+      </w:tr>
+      <w:tr>
+        <w:tblPrEx>
+          <w:tblBorders>
+            <w:top w:val="dotted" w:color="auto" w:sz="4" w:space="0"/>
+            <w:left w:val="dotted" w:color="auto" w:sz="4" w:space="0"/>
+            <w:bottom w:val="dotted" w:color="auto" w:sz="4" w:space="0"/>
+            <w:right w:val="dotted" w:color="auto" w:sz="4" w:space="0"/>
+            <w:insideH w:val="none" w:color="auto" w:sz="0" w:space="0"/>
+            <w:insideV w:val="none" w:color="auto" w:sz="0" w:space="0"/>
+          </w:tblBorders>
+          <w:tblCellMar>
+            <w:top w:w="0" w:type="dxa"/>
+            <w:left w:w="108" w:type="dxa"/>
+            <w:bottom w:w="0" w:type="dxa"/>
+            <w:right w:w="108" w:type="dxa"/>
+          </w:tblCellMar>
+        </w:tblPrEx>
+        <w:trPr>
+          <w:trHeight w:val="244" w:hRule="atLeast"/>
+        </w:trPr>
+        <w:tc>
+          <w:tcPr>
+            <w:tcW w:w="3076" w:type="dxa"/>
+            <w:tcBorders>
+              <w:top w:val="dotted" w:color="auto" w:sz="4" w:space="0"/>
               <w:left w:val="single" w:color="auto" w:sz="4" w:space="0"/>
-              <w:bottom w:val="dotted" w:color="auto" w:sz="4" w:space="0"/>
+              <w:bottom w:val="single" w:color="auto" w:sz="4" w:space="0"/>
+              <w:right w:val="dotted" w:color="auto" w:sz="4" w:space="0"/>
+            </w:tcBorders>
+            <w:shd w:val="clear" w:color="auto" w:fill="auto"/>
+            <w:vAlign w:val="top"/>
+          </w:tcPr>
+          <w:p>
+            <w:pPr>
+              <w:spacing w:line="300" w:lineRule="auto"/>
+              <w:rPr>
+                <w:rFonts w:hint="eastAsia" w:ascii="Times New Roman" w:hAnsi="Times New Roman" w:eastAsia="宋体" w:cs="Times New Roman"/>
+                <w:kern w:val="2"/>
+                <w:sz w:val="24"/>
+                <w:szCs w:val="24"/>
+                <w:lang w:val="en-US" w:eastAsia="zh-CN" w:bidi="ar-SA"/>
+              </w:rPr>
+            </w:pPr>
+            <w:r>
+              <w:rPr>
+                <w:rFonts w:hint="eastAsia"/>
+                <w:sz w:val="24"/>
+              </w:rPr>
+              <w:t>丙二醇甲醚醋酸酯</w:t>
+            </w:r>
+          </w:p>
+        </w:tc>
+        <w:tc>
+          <w:tcPr>
+            <w:tcW w:w="1854" w:type="dxa"/>
+            <w:gridSpan w:val="2"/>
+            <w:tcBorders>
+              <w:top w:val="dotted" w:color="auto" w:sz="4" w:space="0"/>
+              <w:left w:val="dotted" w:color="auto" w:sz="4" w:space="0"/>
+              <w:bottom w:val="single" w:color="auto" w:sz="4" w:space="0"/>
+              <w:right w:val="dotted" w:color="auto" w:sz="4" w:space="0"/>
+            </w:tcBorders>
+            <w:shd w:val="clear" w:color="auto" w:fill="auto"/>
+            <w:vAlign w:val="top"/>
+          </w:tcPr>
+          <w:p>
+            <w:pPr>
+              <w:spacing w:line="300" w:lineRule="auto"/>
+              <w:rPr>
+                <w:rFonts w:hint="eastAsia" w:ascii="Times New Roman" w:hAnsi="Times New Roman" w:eastAsia="宋体" w:cs="Times New Roman"/>
+                <w:kern w:val="2"/>
+                <w:sz w:val="24"/>
+                <w:szCs w:val="24"/>
+                <w:lang w:val="en-US" w:eastAsia="zh-CN" w:bidi="ar-SA"/>
+              </w:rPr>
+            </w:pPr>
+            <w:r>
+              <w:rPr>
+                <w:rFonts w:hint="eastAsia"/>
+                <w:sz w:val="24"/>
+              </w:rPr>
+              <w:t>CN</w:t>
+            </w:r>
+            <w:r>
+              <w:rPr>
+                <w:sz w:val="24"/>
+              </w:rPr>
+              <w:t xml:space="preserve"> </w:t>
+            </w:r>
+            <w:r>
+              <w:rPr>
+                <w:rFonts w:hint="eastAsia"/>
+                <w:sz w:val="24"/>
+              </w:rPr>
+              <w:t>OEL</w:t>
+            </w:r>
+          </w:p>
+        </w:tc>
+        <w:tc>
+          <w:tcPr>
+            <w:tcW w:w="2465" w:type="dxa"/>
+            <w:tcBorders>
+              <w:top w:val="dotted" w:color="auto" w:sz="4" w:space="0"/>
+              <w:left w:val="dotted" w:color="auto" w:sz="4" w:space="0"/>
+              <w:bottom w:val="single" w:color="auto" w:sz="4" w:space="0"/>
+              <w:right w:val="dotted" w:color="auto" w:sz="4" w:space="0"/>
+            </w:tcBorders>
+            <w:shd w:val="clear" w:color="auto" w:fill="auto"/>
+            <w:vAlign w:val="top"/>
+          </w:tcPr>
+          <w:p>
+            <w:pPr>
+              <w:spacing w:line="300" w:lineRule="auto"/>
+              <w:rPr>
+                <w:rFonts w:hint="eastAsia" w:ascii="Times New Roman" w:hAnsi="Times New Roman" w:eastAsia="宋体" w:cs="Times New Roman"/>
+                <w:kern w:val="2"/>
+                <w:sz w:val="24"/>
+                <w:szCs w:val="24"/>
+                <w:lang w:val="en-US" w:eastAsia="zh-CN" w:bidi="ar-SA"/>
+              </w:rPr>
+            </w:pPr>
+            <w:r>
+              <w:rPr>
+                <w:rFonts w:hint="eastAsia"/>
+                <w:sz w:val="24"/>
+              </w:rPr>
+              <w:t>TWA</w:t>
+            </w:r>
+          </w:p>
+        </w:tc>
+        <w:tc>
+          <w:tcPr>
+            <w:tcW w:w="2465" w:type="dxa"/>
+            <w:tcBorders>
+              <w:top w:val="dotted" w:color="auto" w:sz="4" w:space="0"/>
+              <w:left w:val="dotted" w:color="auto" w:sz="4" w:space="0"/>
+              <w:bottom w:val="single" w:color="auto" w:sz="4" w:space="0"/>
               <w:right w:val="single" w:color="auto" w:sz="4" w:space="0"/>
             </w:tcBorders>
             <w:shd w:val="clear" w:color="auto" w:fill="auto"/>
@@ -13376,14 +13397,9 @@
             <w:insideH w:val="none" w:color="auto" w:sz="0" w:space="0"/>
             <w:insideV w:val="none" w:color="auto" w:sz="0" w:space="0"/>
           </w:tblBorders>
-          <w:tblCellMar>
-            <w:top w:w="0" w:type="dxa"/>
-            <w:left w:w="108" w:type="dxa"/>
-            <w:bottom w:w="0" w:type="dxa"/>
-            <w:right w:w="108" w:type="dxa"/>
-          </w:tblCellMar>
         </w:tblPrEx>
         <w:trPr>
+          <w:cantSplit/>
           <w:tblHeader/>
         </w:trPr>
         <w:tc>
@@ -13450,6 +13466,7 @@
           </w:tblCellMar>
         </w:tblPrEx>
         <w:trPr>
+          <w:cantSplit/>
           <w:trHeight w:val="285" w:hRule="atLeast"/>
         </w:trPr>
         <w:tc>
@@ -13511,6 +13528,7 @@
           </w:tblCellMar>
         </w:tblPrEx>
         <w:trPr>
+          <w:cantSplit/>
           <w:trHeight w:val="285" w:hRule="atLeast"/>
         </w:trPr>
         <w:tc>
@@ -13574,6 +13592,7 @@
           </w:tblCellMar>
         </w:tblPrEx>
         <w:trPr>
+          <w:cantSplit/>
           <w:trHeight w:val="285" w:hRule="atLeast"/>
         </w:trPr>
         <w:tc>
@@ -13760,6 +13779,7 @@
           </w:tblCellMar>
         </w:tblPrEx>
         <w:trPr>
+          <w:cantSplit/>
           <w:trHeight w:val="285" w:hRule="atLeast"/>
         </w:trPr>
         <w:tc>
@@ -13936,6 +13956,7 @@
           </w:tblCellMar>
         </w:tblPrEx>
         <w:trPr>
+          <w:cantSplit/>
           <w:trHeight w:val="424" w:hRule="atLeast"/>
         </w:trPr>
         <w:tc>
@@ -14095,6 +14116,7 @@
           </w:tblCellMar>
         </w:tblPrEx>
         <w:trPr>
+          <w:cantSplit/>
           <w:trHeight w:val="285" w:hRule="atLeast"/>
         </w:trPr>
         <w:tc>
@@ -14193,6 +14215,7 @@
           </w:tblCellMar>
         </w:tblPrEx>
         <w:trPr>
+          <w:cantSplit/>
           <w:trHeight w:val="285" w:hRule="atLeast"/>
         </w:trPr>
         <w:tc>
@@ -14413,6 +14436,7 @@
           </w:tblCellMar>
         </w:tblPrEx>
         <w:trPr>
+          <w:cantSplit/>
           <w:trHeight w:val="285" w:hRule="atLeast"/>
         </w:trPr>
         <w:tc>
@@ -14625,6 +14649,7 @@
           </w:tblCellMar>
         </w:tblPrEx>
         <w:trPr>
+          <w:cantSplit/>
           <w:trHeight w:val="1169" w:hRule="atLeast"/>
         </w:trPr>
         <w:tc>
@@ -14853,6 +14878,7 @@
           </w:tblCellMar>
         </w:tblPrEx>
         <w:trPr>
+          <w:cantSplit/>
           <w:trHeight w:val="285" w:hRule="atLeast"/>
         </w:trPr>
         <w:tc>
@@ -14989,6 +15015,7 @@
           </w:tblCellMar>
         </w:tblPrEx>
         <w:trPr>
+          <w:cantSplit/>
           <w:trHeight w:val="285" w:hRule="atLeast"/>
         </w:trPr>
         <w:tc>
@@ -15127,6 +15154,7 @@
           </w:tblCellMar>
         </w:tblPrEx>
         <w:trPr>
+          <w:cantSplit/>
           <w:trHeight w:val="285" w:hRule="atLeast"/>
         </w:trPr>
         <w:tc>
@@ -15314,6 +15342,7 @@
           </w:tblCellMar>
         </w:tblPrEx>
         <w:trPr>
+          <w:cantSplit/>
           <w:trHeight w:val="285" w:hRule="atLeast"/>
         </w:trPr>
         <w:tc>
@@ -15474,6 +15503,7 @@
           </w:tblCellMar>
         </w:tblPrEx>
         <w:trPr>
+          <w:cantSplit/>
           <w:trHeight w:val="285" w:hRule="atLeast"/>
         </w:trPr>
         <w:tc>
@@ -15632,6 +15662,7 @@
           </w:tblCellMar>
         </w:tblPrEx>
         <w:trPr>
+          <w:cantSplit/>
           <w:trHeight w:val="285" w:hRule="atLeast"/>
         </w:trPr>
         <w:tc>

</xml_diff>

<commit_message>
feat(msds): release English quality fixes v3.26.2
</commit_message>
<xml_diff>
--- a/MSDS Skill/examples/template_reference_en.docx
+++ b/MSDS Skill/examples/template_reference_en.docx
@@ -76,7 +76,7 @@
                 <w:b/>
                 <w:sz w:val="24"/>
               </w:rPr>
-              <w:t>Identification</w:t>
+              <w:t>Identification of the substance/mixture and of the company/undertaking</w:t>
             </w:r>
           </w:p>
         </w:tc>
@@ -190,7 +190,7 @@
                 <w:kern w:val="0"/>
                 <w:sz w:val="24"/>
               </w:rPr>
-              <w:t>name：</w:t>
+              <w:t xml:space="preserve">name: </w:t>
             </w:r>
           </w:p>
         </w:tc>
@@ -301,7 +301,7 @@
                 <w:b/>
                 <w:sz w:val="24"/>
               </w:rPr>
-              <w:t>：</w:t>
+              <w:t xml:space="preserve">: </w:t>
             </w:r>
           </w:p>
         </w:tc>
@@ -456,7 +456,7 @@
                 <w:b/>
                 <w:sz w:val="24"/>
               </w:rPr>
-              <w:t>：</w:t>
+              <w:t xml:space="preserve">: </w:t>
             </w:r>
           </w:p>
         </w:tc>
@@ -719,7 +719,7 @@
                 <w:kern w:val="0"/>
                 <w:sz w:val="24"/>
               </w:rPr>
-              <w:t>：</w:t>
+              <w:t xml:space="preserve">: </w:t>
             </w:r>
           </w:p>
         </w:tc>
@@ -952,7 +952,7 @@
                 <w:kern w:val="0"/>
                 <w:sz w:val="24"/>
               </w:rPr>
-              <w:t>：</w:t>
+              <w:t xml:space="preserve">: </w:t>
             </w:r>
           </w:p>
         </w:tc>
@@ -1072,7 +1072,7 @@
                 <w:kern w:val="0"/>
                 <w:sz w:val="24"/>
               </w:rPr>
-              <w:t>：</w:t>
+              <w:t xml:space="preserve">: </w:t>
             </w:r>
           </w:p>
         </w:tc>
@@ -1528,7 +1528,7 @@
                 <w:kern w:val="0"/>
                 <w:sz w:val="24"/>
               </w:rPr>
-              <w:t>Classification：</w:t>
+              <w:t xml:space="preserve">Classification: </w:t>
             </w:r>
           </w:p>
         </w:tc>
@@ -1684,7 +1684,7 @@
                 <w:kern w:val="0"/>
                 <w:sz w:val="24"/>
               </w:rPr>
-              <w:t>GHS Label Elements：</w:t>
+              <w:t xml:space="preserve">GHS Label Elements: </w:t>
             </w:r>
           </w:p>
         </w:tc>
@@ -1808,7 +1808,7 @@
                 <w:kern w:val="0"/>
                 <w:sz w:val="24"/>
               </w:rPr>
-              <w:t>GHS Pictograms：</w:t>
+              <w:t xml:space="preserve">GHS Pictograms: </w:t>
             </w:r>
           </w:p>
         </w:tc>
@@ -1968,7 +1968,7 @@
                 <w:kern w:val="0"/>
                 <w:sz w:val="24"/>
               </w:rPr>
-              <w:t>Signal Word：</w:t>
+              <w:t xml:space="preserve">Signal Word: </w:t>
             </w:r>
           </w:p>
         </w:tc>
@@ -2123,7 +2123,7 @@
                 <w:kern w:val="0"/>
                 <w:sz w:val="24"/>
               </w:rPr>
-              <w:t>Hazard Statements：</w:t>
+              <w:t xml:space="preserve">Hazard Statements: </w:t>
             </w:r>
           </w:p>
         </w:tc>
@@ -2275,7 +2275,7 @@
                 <w:b/>
                 <w:sz w:val="24"/>
               </w:rPr>
-              <w:t>Precautionary Statements：</w:t>
+              <w:t xml:space="preserve">Precautionary Statements: </w:t>
             </w:r>
           </w:p>
         </w:tc>
@@ -2450,7 +2450,7 @@
                 <w:kern w:val="0"/>
                 <w:sz w:val="24"/>
               </w:rPr>
-              <w:t>Physical and Chemical Hazards：</w:t>
+              <w:t xml:space="preserve">Physical and Chemical Hazards: </w:t>
             </w:r>
           </w:p>
         </w:tc>
@@ -2629,8 +2629,9 @@
                 <w:kern w:val="0"/>
                 <w:sz w:val="24"/>
                 <w:lang w:val="en-US" w:eastAsia="zh-CN"/>
-              </w:rPr>
-              <w:t>吸入：</w:t>
+                <w:b/>
+              </w:rPr>
+              <w:t>Inhalation:</w:t>
             </w:r>
           </w:p>
         </w:tc>
@@ -2744,8 +2745,9 @@
                 <w:kern w:val="0"/>
                 <w:sz w:val="24"/>
                 <w:lang w:val="en-US" w:eastAsia="zh-CN"/>
-              </w:rPr>
-              <w:t>食入：</w:t>
+                <w:b/>
+              </w:rPr>
+              <w:t>Ingestion:</w:t>
             </w:r>
           </w:p>
         </w:tc>
@@ -2859,8 +2861,9 @@
                 <w:kern w:val="0"/>
                 <w:sz w:val="24"/>
                 <w:lang w:val="en-US" w:eastAsia="zh-CN"/>
-              </w:rPr>
-              <w:t>皮肤：</w:t>
+                <w:b/>
+              </w:rPr>
+              <w:t>Skin:</w:t>
             </w:r>
           </w:p>
         </w:tc>
@@ -2974,8 +2977,9 @@
                 <w:kern w:val="0"/>
                 <w:sz w:val="24"/>
                 <w:lang w:val="en-US" w:eastAsia="zh-CN"/>
-              </w:rPr>
-              <w:t>眼睛：</w:t>
+                <w:b/>
+              </w:rPr>
+              <w:t>Eyes:</w:t>
             </w:r>
           </w:p>
         </w:tc>
@@ -3089,8 +3093,9 @@
                 <w:kern w:val="0"/>
                 <w:sz w:val="24"/>
                 <w:lang w:val="en-US" w:eastAsia="zh-CN"/>
-              </w:rPr>
-              <w:t>症状和体征：</w:t>
+                <w:b/>
+              </w:rPr>
+              <w:t>Signs and symptoms:</w:t>
             </w:r>
           </w:p>
         </w:tc>
@@ -3554,7 +3559,7 @@
                 <w:kern w:val="0"/>
                 <w:sz w:val="24"/>
               </w:rPr>
-              <w:t>Product type：</w:t>
+              <w:t xml:space="preserve">Product type: </w:t>
             </w:r>
           </w:p>
         </w:tc>
@@ -4432,7 +4437,7 @@
                 <w:b/>
                 <w:sz w:val="24"/>
               </w:rPr>
-              <w:t>General measures：</w:t>
+              <w:t xml:space="preserve">General measures: </w:t>
             </w:r>
           </w:p>
         </w:tc>
@@ -4555,7 +4560,7 @@
                 <w:b/>
                 <w:sz w:val="24"/>
               </w:rPr>
-              <w:t>Ingestion：</w:t>
+              <w:t xml:space="preserve">Ingestion: </w:t>
             </w:r>
           </w:p>
         </w:tc>
@@ -4687,7 +4692,7 @@
                 <w:b/>
                 <w:sz w:val="24"/>
               </w:rPr>
-              <w:t>Eye contact：</w:t>
+              <w:t xml:space="preserve">Eye contact: </w:t>
             </w:r>
           </w:p>
         </w:tc>
@@ -4811,7 +4816,7 @@
                 <w:b/>
                 <w:sz w:val="24"/>
               </w:rPr>
-              <w:t>Skin contact：</w:t>
+              <w:t xml:space="preserve">Skin contact: </w:t>
             </w:r>
           </w:p>
         </w:tc>
@@ -4937,7 +4942,7 @@
                 <w:b/>
                 <w:sz w:val="24"/>
               </w:rPr>
-              <w:t>Inhalation：</w:t>
+              <w:t xml:space="preserve">Inhalation: </w:t>
             </w:r>
           </w:p>
         </w:tc>
@@ -5209,7 +5214,7 @@
                 <w:b/>
                 <w:sz w:val="24"/>
               </w:rPr>
-              <w:t>agents：</w:t>
+              <w:t xml:space="preserve">agents: </w:t>
             </w:r>
           </w:p>
         </w:tc>
@@ -5439,7 +5444,7 @@
                 <w:b/>
                 <w:sz w:val="24"/>
               </w:rPr>
-              <w:t>agents：</w:t>
+              <w:t xml:space="preserve">agents: </w:t>
             </w:r>
           </w:p>
         </w:tc>
@@ -5634,7 +5639,7 @@
                 <w:sz w:val="24"/>
                 <w:lang w:val="en-US" w:eastAsia="zh-CN"/>
               </w:rPr>
-              <w:t>substances or mixtures：</w:t>
+              <w:t xml:space="preserve">substances or mixtures: </w:t>
             </w:r>
           </w:p>
         </w:tc>
@@ -5853,7 +5858,7 @@
                 <w:b/>
                 <w:sz w:val="24"/>
               </w:rPr>
-              <w:t>protective equipment：</w:t>
+              <w:t xml:space="preserve">protective equipment: </w:t>
             </w:r>
           </w:p>
         </w:tc>
@@ -6032,7 +6037,7 @@
                 <w:b/>
                 <w:sz w:val="24"/>
               </w:rPr>
-              <w:t>Measures for accidental leakage</w:t>
+              <w:t xml:space="preserve"> Accidental release measures</w:t>
             </w:r>
           </w:p>
         </w:tc>
@@ -6136,7 +6141,7 @@
                 <w:b/>
                 <w:sz w:val="24"/>
               </w:rPr>
-              <w:t>Firefighting precautions</w:t>
+              <w:t>Personal precautions, protective equipment and</w:t>
             </w:r>
           </w:p>
           <w:p>
@@ -6173,7 +6178,7 @@
                 <w:b/>
                 <w:sz w:val="24"/>
               </w:rPr>
-              <w:t>protective equipment：</w:t>
+              <w:t>emergency procedures:</w:t>
             </w:r>
           </w:p>
         </w:tc>
@@ -6375,7 +6380,7 @@
                 <w:b/>
                 <w:sz w:val="24"/>
               </w:rPr>
-              <w:t>precautions：</w:t>
+              <w:t xml:space="preserve">precautions: </w:t>
             </w:r>
           </w:p>
         </w:tc>
@@ -6530,7 +6535,7 @@
                 <w:b/>
                 <w:sz w:val="24"/>
               </w:rPr>
-              <w:t>containment and cleaning up：</w:t>
+              <w:t xml:space="preserve">containment and cleaning up: </w:t>
             </w:r>
           </w:p>
         </w:tc>
@@ -6674,7 +6679,7 @@
                 <w:b/>
                 <w:sz w:val="24"/>
               </w:rPr>
-              <w:t>Operation and storage</w:t>
+              <w:t xml:space="preserve"> Handling and storage</w:t>
             </w:r>
           </w:p>
         </w:tc>
@@ -6773,7 +6778,7 @@
                 <w:b/>
                 <w:sz w:val="24"/>
               </w:rPr>
-              <w:t>Precautions for safe handling：</w:t>
+              <w:t xml:space="preserve">Precautions for safe handling: </w:t>
             </w:r>
           </w:p>
         </w:tc>
@@ -6934,7 +6939,7 @@
                 <w:b/>
                 <w:sz w:val="24"/>
               </w:rPr>
-              <w:t>Conditions for safe storage：</w:t>
+              <w:t xml:space="preserve">Conditions for safe storage: </w:t>
             </w:r>
           </w:p>
         </w:tc>
@@ -7201,7 +7206,7 @@
                 <w:sz w:val="24"/>
                 <w:lang w:val="en-US" w:eastAsia="zh-CN"/>
               </w:rPr>
-              <w:t>Exposure controls：</w:t>
+              <w:t xml:space="preserve">Exposure controls: </w:t>
             </w:r>
           </w:p>
         </w:tc>
@@ -7266,7 +7271,7 @@
                 <w:b/>
                 <w:sz w:val="24"/>
               </w:rPr>
-              <w:t>Respiratory protection：</w:t>
+              <w:t xml:space="preserve">Respiratory protection: </w:t>
             </w:r>
           </w:p>
         </w:tc>
@@ -7379,14 +7384,13 @@
                 <w:b/>
                 <w:sz w:val="24"/>
               </w:rPr>
-              <w:t>Hand protection：</w:t>
-            </w:r>
-            <w:r>
-              <w:rPr>
-                <w:b/>
-                <w:sz w:val="24"/>
-              </w:rPr>
-              <w:tab/>
+              <w:t>Hand protection:</w:t>
+            </w:r>
+            <w:r>
+              <w:rPr>
+                <w:b/>
+                <w:sz w:val="24"/>
+              </w:rPr>
             </w:r>
             <w:r>
               <w:rPr>
@@ -7395,7 +7399,6 @@
                 <w:kern w:val="0"/>
                 <w:sz w:val="24"/>
               </w:rPr>
-              <w:t>喷涂过程中要求有呼吸防护设备。</w:t>
             </w:r>
           </w:p>
         </w:tc>
@@ -7510,7 +7513,7 @@
                 <w:b/>
                 <w:sz w:val="24"/>
               </w:rPr>
-              <w:t>Suitable material for protective gloves：</w:t>
+              <w:t xml:space="preserve">Suitable material for protective gloves: </w:t>
             </w:r>
           </w:p>
         </w:tc>
@@ -7758,7 +7761,7 @@
                 <w:b/>
                 <w:sz w:val="24"/>
               </w:rPr>
-              <w:t>Butyl rubber – IIR：</w:t>
+              <w:t xml:space="preserve">Butyl rubber – IIR: </w:t>
             </w:r>
           </w:p>
         </w:tc>
@@ -7894,7 +7897,7 @@
                 <w:b/>
                 <w:sz w:val="24"/>
               </w:rPr>
-              <w:t>Nitrile rubber – NBR：</w:t>
+              <w:t xml:space="preserve">Nitrile rubber – NBR: </w:t>
             </w:r>
           </w:p>
         </w:tc>
@@ -8128,7 +8131,7 @@
                 <w:b/>
                 <w:sz w:val="24"/>
               </w:rPr>
-              <w:t>Eye protection：</w:t>
+              <w:t xml:space="preserve">Eye protection: </w:t>
             </w:r>
           </w:p>
         </w:tc>
@@ -8254,7 +8257,7 @@
                 <w:b/>
                 <w:sz w:val="24"/>
               </w:rPr>
-              <w:t>Body protection：</w:t>
+              <w:t xml:space="preserve">Body protection: </w:t>
             </w:r>
           </w:p>
         </w:tc>
@@ -8376,7 +8379,7 @@
                 <w:sz w:val="24"/>
                 <w:lang w:val="en-US" w:eastAsia="zh-CN"/>
               </w:rPr>
-              <w:t>Engineering controls：</w:t>
+              <w:t xml:space="preserve">Engineering controls: </w:t>
             </w:r>
           </w:p>
         </w:tc>
@@ -9292,7 +9295,7 @@
                 <w:sz w:val="24"/>
                 <w:lang w:val="en-US" w:eastAsia="zh-CN"/>
               </w:rPr>
-              <w:t>Appearance：</w:t>
+              <w:t xml:space="preserve">Appearance: </w:t>
             </w:r>
           </w:p>
         </w:tc>
@@ -9430,7 +9433,7 @@
                 <w:sz w:val="24"/>
                 <w:lang w:val="en-US" w:eastAsia="zh-CN"/>
               </w:rPr>
-              <w:t xml:space="preserve">Odour threshold：    </w:t>
+              <w:t xml:space="preserve">Odour threshold:     </w:t>
             </w:r>
             <w:r>
               <w:rPr>
@@ -9577,7 +9580,7 @@
                 <w:sz w:val="24"/>
                 <w:lang w:val="en-US" w:eastAsia="zh-CN"/>
               </w:rPr>
-              <w:t>pH value：</w:t>
+              <w:t xml:space="preserve">pH value: </w:t>
             </w:r>
           </w:p>
         </w:tc>
@@ -9716,7 +9719,7 @@
                 <w:sz w:val="24"/>
                 <w:lang w:val="en-US" w:eastAsia="zh-CN"/>
               </w:rPr>
-              <w:t>Ionicity：</w:t>
+              <w:t xml:space="preserve">Ionicity: </w:t>
             </w:r>
           </w:p>
         </w:tc>
@@ -9857,7 +9860,7 @@
                 <w:sz w:val="24"/>
                 <w:lang w:val="en-US" w:eastAsia="zh-CN"/>
               </w:rPr>
-              <w:t>Initial boiling point：</w:t>
+              <w:t xml:space="preserve">Initial boiling point: </w:t>
             </w:r>
           </w:p>
         </w:tc>
@@ -9993,7 +9996,7 @@
                 <w:sz w:val="24"/>
                 <w:lang w:val="en-US" w:eastAsia="zh-CN"/>
               </w:rPr>
-              <w:t xml:space="preserve">Flash point：   </w:t>
+              <w:t xml:space="preserve">Flash point:    </w:t>
             </w:r>
             <w:r>
               <w:rPr>
@@ -10140,7 +10143,7 @@
                 <w:sz w:val="24"/>
                 <w:lang w:val="en-US" w:eastAsia="zh-CN"/>
               </w:rPr>
-              <w:t xml:space="preserve">Evaporation rate：    </w:t>
+              <w:t xml:space="preserve">Evaporation rate:     </w:t>
             </w:r>
             <w:r>
               <w:rPr>
@@ -10298,7 +10301,7 @@
                 <w:sz w:val="24"/>
                 <w:lang w:val="en-US" w:eastAsia="zh-CN"/>
               </w:rPr>
-              <w:t>Flammability：</w:t>
+              <w:t xml:space="preserve">Flammability: </w:t>
             </w:r>
           </w:p>
         </w:tc>
@@ -10423,7 +10426,7 @@
                 <w:sz w:val="24"/>
                 <w:lang w:val="en-US" w:eastAsia="zh-CN"/>
               </w:rPr>
-              <w:t xml:space="preserve">Heat of combustion：      </w:t>
+              <w:t xml:space="preserve">Heat of combustion:       </w:t>
             </w:r>
           </w:p>
         </w:tc>
@@ -10600,7 +10603,7 @@
                 <w:sz w:val="24"/>
                 <w:lang w:val="en-US" w:eastAsia="zh-CN"/>
               </w:rPr>
-              <w:t>pressure：</w:t>
+              <w:t xml:space="preserve">pressure: </w:t>
             </w:r>
           </w:p>
         </w:tc>
@@ -10736,7 +10739,7 @@
                 <w:sz w:val="24"/>
                 <w:lang w:val="en-US" w:eastAsia="zh-CN"/>
               </w:rPr>
-              <w:t>Relative vapour density：</w:t>
+              <w:t xml:space="preserve">Relative vapour density: </w:t>
             </w:r>
           </w:p>
         </w:tc>
@@ -10872,7 +10875,7 @@
                 <w:sz w:val="24"/>
                 <w:lang w:val="en-US" w:eastAsia="zh-CN"/>
               </w:rPr>
-              <w:t xml:space="preserve">Density：   </w:t>
+              <w:t xml:space="preserve">Density:    </w:t>
             </w:r>
           </w:p>
         </w:tc>
@@ -11010,7 +11013,7 @@
                 <w:sz w:val="24"/>
                 <w:lang w:val="en-US" w:eastAsia="zh-CN"/>
               </w:rPr>
-              <w:t>Solubility in water：</w:t>
+              <w:t xml:space="preserve">Solubility in water: </w:t>
             </w:r>
           </w:p>
         </w:tc>
@@ -11146,7 +11149,7 @@
                 <w:sz w:val="24"/>
                 <w:lang w:val="en-US" w:eastAsia="zh-CN"/>
               </w:rPr>
-              <w:t xml:space="preserve">Surface tension：  </w:t>
+              <w:t xml:space="preserve">Surface tension:   </w:t>
             </w:r>
           </w:p>
         </w:tc>
@@ -11322,7 +11325,7 @@
                 <w:sz w:val="24"/>
                 <w:lang w:val="en-US" w:eastAsia="zh-CN"/>
               </w:rPr>
-              <w:t>partition coefficient)：</w:t>
+              <w:t xml:space="preserve">partition coefficient): </w:t>
             </w:r>
           </w:p>
         </w:tc>
@@ -11500,7 +11503,7 @@
                 <w:sz w:val="24"/>
                 <w:lang w:val="en-US" w:eastAsia="zh-CN"/>
               </w:rPr>
-              <w:t>temperature：</w:t>
+              <w:t xml:space="preserve">temperature: </w:t>
             </w:r>
           </w:p>
         </w:tc>
@@ -11637,7 +11640,7 @@
                 <w:sz w:val="24"/>
                 <w:lang w:val="en-US" w:eastAsia="zh-CN"/>
               </w:rPr>
-              <w:t>Ignition temperature：</w:t>
+              <w:t xml:space="preserve">Ignition temperature: </w:t>
             </w:r>
           </w:p>
         </w:tc>
@@ -11817,7 +11820,7 @@
                 <w:sz w:val="24"/>
                 <w:lang w:val="en-US" w:eastAsia="zh-CN"/>
               </w:rPr>
-              <w:t>temperature：</w:t>
+              <w:t xml:space="preserve">temperature: </w:t>
             </w:r>
           </w:p>
         </w:tc>
@@ -11957,7 +11960,7 @@
                 <w:sz w:val="24"/>
                 <w:lang w:val="en-US" w:eastAsia="zh-CN"/>
               </w:rPr>
-              <w:t>Dynamic viscosity：</w:t>
+              <w:t xml:space="preserve">Dynamic viscosity: </w:t>
             </w:r>
           </w:p>
         </w:tc>
@@ -12093,7 +12096,7 @@
                 <w:sz w:val="24"/>
                 <w:lang w:val="en-US" w:eastAsia="zh-CN"/>
               </w:rPr>
-              <w:t>Explosive properties：</w:t>
+              <w:t xml:space="preserve">Explosive properties: </w:t>
             </w:r>
           </w:p>
         </w:tc>
@@ -12229,7 +12232,7 @@
                 <w:sz w:val="24"/>
                 <w:lang w:val="en-US" w:eastAsia="zh-CN"/>
               </w:rPr>
-              <w:t>Dust explosion class：</w:t>
+              <w:t xml:space="preserve">Dust explosion class: </w:t>
             </w:r>
           </w:p>
         </w:tc>
@@ -12365,7 +12368,7 @@
                 <w:sz w:val="24"/>
                 <w:lang w:val="en-US" w:eastAsia="zh-CN"/>
               </w:rPr>
-              <w:t>Solid content：</w:t>
+              <w:t xml:space="preserve">Solid content: </w:t>
             </w:r>
           </w:p>
         </w:tc>
@@ -12501,7 +12504,7 @@
                 <w:sz w:val="24"/>
                 <w:lang w:val="en-US" w:eastAsia="zh-CN"/>
               </w:rPr>
-              <w:t>Other information：</w:t>
+              <w:t xml:space="preserve">Other information: </w:t>
             </w:r>
           </w:p>
         </w:tc>
@@ -12735,7 +12738,7 @@
                 <w:b/>
                 <w:sz w:val="24"/>
               </w:rPr>
-              <w:t>Chemical stability：</w:t>
+              <w:t xml:space="preserve">Chemical stability: </w:t>
             </w:r>
           </w:p>
         </w:tc>
@@ -12871,7 +12874,7 @@
                 <w:b/>
                 <w:sz w:val="24"/>
               </w:rPr>
-              <w:t>Hazardous decomposition products：</w:t>
+              <w:t xml:space="preserve">Hazardous decomposition products: </w:t>
             </w:r>
           </w:p>
         </w:tc>
@@ -13008,7 +13011,7 @@
                 <w:b/>
                 <w:sz w:val="24"/>
               </w:rPr>
-              <w:t>Possible hazardous reactions：</w:t>
+              <w:t xml:space="preserve">Possible hazardous reactions: </w:t>
             </w:r>
           </w:p>
         </w:tc>
@@ -13157,7 +13160,7 @@
                 <w:b/>
                 <w:sz w:val="24"/>
               </w:rPr>
-              <w:t>：</w:t>
+              <w:t xml:space="preserve">: </w:t>
             </w:r>
           </w:p>
         </w:tc>
@@ -13301,7 +13304,7 @@
                 <w:sz w:val="24"/>
                 <w:lang w:val="en-US" w:eastAsia="zh-CN"/>
               </w:rPr>
-              <w:t>Incompatible materials：</w:t>
+              <w:t xml:space="preserve">Incompatible materials: </w:t>
             </w:r>
           </w:p>
         </w:tc>
@@ -13443,7 +13446,7 @@
                 <w:b/>
                 <w:sz w:val="24"/>
               </w:rPr>
-              <w:t>Toxicity information</w:t>
+              <w:t xml:space="preserve"> Toxicological information</w:t>
             </w:r>
           </w:p>
         </w:tc>
@@ -13662,7 +13665,7 @@
                 <w:b/>
                 <w:sz w:val="24"/>
               </w:rPr>
-              <w:t>Acute toxicity：</w:t>
+              <w:t xml:space="preserve">Acute toxicity: </w:t>
             </w:r>
           </w:p>
         </w:tc>
@@ -14284,7 +14287,7 @@
                 <w:b/>
                 <w:sz w:val="24"/>
               </w:rPr>
-              <w:t>Primary skin irritation：</w:t>
+              <w:t xml:space="preserve">Primary skin irritation: </w:t>
             </w:r>
           </w:p>
         </w:tc>
@@ -14505,7 +14508,7 @@
                 <w:b/>
                 <w:sz w:val="24"/>
               </w:rPr>
-              <w:t>Primary eye irritation：</w:t>
+              <w:t xml:space="preserve">Primary eye irritation: </w:t>
             </w:r>
           </w:p>
         </w:tc>
@@ -14718,7 +14721,7 @@
                 <w:b/>
                 <w:sz w:val="24"/>
               </w:rPr>
-              <w:t>Sensitization：</w:t>
+              <w:t xml:space="preserve">Sensitization: </w:t>
             </w:r>
           </w:p>
         </w:tc>
@@ -14947,7 +14950,7 @@
                 <w:b/>
                 <w:sz w:val="24"/>
               </w:rPr>
-              <w:t>Mutagenicity：</w:t>
+              <w:t xml:space="preserve">Mutagenicity: </w:t>
             </w:r>
           </w:p>
         </w:tc>
@@ -15086,7 +15089,7 @@
                 <w:sz w:val="24"/>
                 <w:lang w:val="en-US" w:eastAsia="zh-CN"/>
               </w:rPr>
-              <w:t>Carcinogenicity：</w:t>
+              <w:t xml:space="preserve">Carcinogenicity: </w:t>
             </w:r>
           </w:p>
         </w:tc>
@@ -15226,7 +15229,7 @@
                 <w:sz w:val="24"/>
                 <w:lang w:val="en-US" w:eastAsia="zh-CN"/>
               </w:rPr>
-              <w:t>Reproductive toxicity：</w:t>
+              <w:t xml:space="preserve">Reproductive toxicity: </w:t>
             </w:r>
           </w:p>
         </w:tc>
@@ -15283,7 +15286,7 @@
                 <w:sz w:val="24"/>
                 <w:lang w:eastAsia="zh-CN"/>
               </w:rPr>
-              <w:t>：</w:t>
+              <w:t xml:space="preserve">: </w:t>
             </w:r>
           </w:p>
         </w:tc>
@@ -15444,7 +15447,7 @@
                 <w:sz w:val="24"/>
                 <w:lang w:eastAsia="zh-CN"/>
               </w:rPr>
-              <w:t>：</w:t>
+              <w:t xml:space="preserve">: </w:t>
             </w:r>
           </w:p>
         </w:tc>
@@ -15603,7 +15606,7 @@
                 <w:sz w:val="24"/>
                 <w:lang w:eastAsia="zh-CN"/>
               </w:rPr>
-              <w:t>：</w:t>
+              <w:t xml:space="preserve">: </w:t>
             </w:r>
           </w:p>
         </w:tc>
@@ -15814,7 +15817,7 @@
                 <w:sz w:val="24"/>
                 <w:lang w:val="en-US" w:eastAsia="zh-CN"/>
               </w:rPr>
-              <w:t>exposure)：</w:t>
+              <w:t xml:space="preserve">exposure): </w:t>
             </w:r>
           </w:p>
         </w:tc>
@@ -15954,7 +15957,7 @@
                 <w:sz w:val="24"/>
                 <w:lang w:val="en-US" w:eastAsia="zh-CN"/>
               </w:rPr>
-              <w:t>Aspiration hazard：</w:t>
+              <w:t xml:space="preserve">Aspiration hazard: </w:t>
             </w:r>
           </w:p>
         </w:tc>
@@ -16081,7 +16084,7 @@
                 <w:sz w:val="24"/>
                 <w:lang w:val="en-US" w:eastAsia="zh-CN"/>
               </w:rPr>
-              <w:t>Additional information：</w:t>
+              <w:t xml:space="preserve">Additional information: </w:t>
             </w:r>
           </w:p>
         </w:tc>
@@ -16547,7 +16550,7 @@
                 <w:b/>
                 <w:sz w:val="24"/>
               </w:rPr>
-              <w:t>Ecotoxicity：</w:t>
+              <w:t xml:space="preserve">Ecotoxicity: </w:t>
             </w:r>
           </w:p>
         </w:tc>
@@ -16860,7 +16863,7 @@
                 <w:b/>
                 <w:sz w:val="24"/>
               </w:rPr>
-              <w:t>degradability：</w:t>
+              <w:t xml:space="preserve">degradability: </w:t>
             </w:r>
           </w:p>
         </w:tc>
@@ -17040,7 +17043,7 @@
                 <w:b/>
                 <w:sz w:val="24"/>
               </w:rPr>
-              <w:t>Other adverse effects：</w:t>
+              <w:t xml:space="preserve">Other adverse effects: </w:t>
             </w:r>
           </w:p>
         </w:tc>
@@ -17356,7 +17359,7 @@
                 <w:b/>
                 <w:sz w:val="24"/>
               </w:rPr>
-              <w:t>Disposal methods：</w:t>
+              <w:t xml:space="preserve">Disposal methods: </w:t>
             </w:r>
           </w:p>
         </w:tc>
@@ -17616,7 +17619,7 @@
                 <w:b/>
                 <w:sz w:val="24"/>
               </w:rPr>
-              <w:t>Transportation information</w:t>
+              <w:t xml:space="preserve"> Transport information</w:t>
             </w:r>
           </w:p>
         </w:tc>
@@ -17710,7 +17713,7 @@
                 <w:b/>
                 <w:sz w:val="24"/>
               </w:rPr>
-              <w:t>Road and rail transport：</w:t>
+              <w:t xml:space="preserve">Road and rail transport: </w:t>
             </w:r>
           </w:p>
         </w:tc>
@@ -17846,7 +17849,7 @@
                 <w:b/>
                 <w:sz w:val="24"/>
               </w:rPr>
-              <w:t>Maritime transport：</w:t>
+              <w:t xml:space="preserve">Maritime transport: </w:t>
             </w:r>
           </w:p>
         </w:tc>
@@ -17983,7 +17986,7 @@
                 <w:b/>
                 <w:sz w:val="24"/>
               </w:rPr>
-              <w:t>Air transport：</w:t>
+              <w:t xml:space="preserve">Air transport: </w:t>
             </w:r>
           </w:p>
         </w:tc>
@@ -18120,7 +18123,7 @@
                 <w:b/>
                 <w:sz w:val="24"/>
               </w:rPr>
-              <w:t>Special precautions for user：</w:t>
+              <w:t xml:space="preserve">Special precautions for user: </w:t>
             </w:r>
           </w:p>
         </w:tc>
@@ -18488,7 +18491,7 @@
                 <w:kern w:val="0"/>
                 <w:sz w:val="24"/>
               </w:rPr>
-              <w:t>Other provisions：</w:t>
+              <w:t xml:space="preserve">Other provisions: </w:t>
             </w:r>
           </w:p>
         </w:tc>
@@ -18546,7 +18549,7 @@
                 <w:kern w:val="0"/>
                 <w:sz w:val="24"/>
               </w:rPr>
-              <w:t>Complies with the following regulations：</w:t>
+              <w:t xml:space="preserve">Complies with the following regulations: </w:t>
             </w:r>
           </w:p>
         </w:tc>
@@ -19442,16 +19445,7 @@
         <w:sz w:val="36"/>
         <w:szCs w:val="36"/>
       </w:rPr>
-      <w:t xml:space="preserve"> </w:t>
-    </w:r>
-    <w:r>
-      <w:rPr>
-        <w:rFonts w:hint="eastAsia" w:cs="Arial" w:asciiTheme="majorEastAsia" w:hAnsiTheme="majorEastAsia" w:eastAsiaTheme="majorEastAsia"/>
-        <w:b/>
-        <w:sz w:val="44"/>
-        <w:szCs w:val="44"/>
-      </w:rPr>
-      <w:t>物料安全数据表</w:t>
+      <w:t xml:space="preserve"> SAFETY DATA SHEET</w:t>
     </w:r>
   </w:p>
   <w:p>
@@ -19471,16 +19465,7 @@
         <w:sz w:val="18"/>
         <w:szCs w:val="18"/>
       </w:rPr>
-      <w:t>Version：V1.</w:t>
-    </w:r>
-    <w:r>
-      <w:rPr>
-        <w:rFonts w:hint="eastAsia" w:ascii="Arial" w:eastAsia="楷体_GB2312"/>
-        <w:sz w:val="18"/>
-        <w:szCs w:val="18"/>
-        <w:lang w:val="en-US" w:eastAsia="zh-CN"/>
-      </w:rPr>
-      <w:t>0</w:t>
+      <w:t>Version: 1.0</w:t>
     </w:r>
   </w:p>
   <w:tbl>

</xml_diff>

<commit_message>
feat(msds): release v3.27.0 with standard EN master template and format lock
</commit_message>
<xml_diff>
--- a/MSDS Skill/examples/template_reference_en.docx
+++ b/MSDS Skill/examples/template_reference_en.docx
@@ -76,7 +76,7 @@
                 <w:b/>
                 <w:sz w:val="24"/>
               </w:rPr>
-              <w:t>Identification of the substance/mixture and of the company/undertaking</w:t>
+              <w:t>Identification</w:t>
             </w:r>
           </w:p>
         </w:tc>
@@ -190,7 +190,7 @@
                 <w:kern w:val="0"/>
                 <w:sz w:val="24"/>
               </w:rPr>
-              <w:t xml:space="preserve">name: </w:t>
+              <w:t>name：</w:t>
             </w:r>
           </w:p>
         </w:tc>
@@ -301,7 +301,7 @@
                 <w:b/>
                 <w:sz w:val="24"/>
               </w:rPr>
-              <w:t xml:space="preserve">: </w:t>
+              <w:t>：</w:t>
             </w:r>
           </w:p>
         </w:tc>
@@ -456,7 +456,7 @@
                 <w:b/>
                 <w:sz w:val="24"/>
               </w:rPr>
-              <w:t xml:space="preserve">: </w:t>
+              <w:t>：</w:t>
             </w:r>
           </w:p>
         </w:tc>
@@ -719,7 +719,7 @@
                 <w:kern w:val="0"/>
                 <w:sz w:val="24"/>
               </w:rPr>
-              <w:t xml:space="preserve">: </w:t>
+              <w:t>：</w:t>
             </w:r>
           </w:p>
         </w:tc>
@@ -952,7 +952,7 @@
                 <w:kern w:val="0"/>
                 <w:sz w:val="24"/>
               </w:rPr>
-              <w:t xml:space="preserve">: </w:t>
+              <w:t>：</w:t>
             </w:r>
           </w:p>
         </w:tc>
@@ -1072,7 +1072,7 @@
                 <w:kern w:val="0"/>
                 <w:sz w:val="24"/>
               </w:rPr>
-              <w:t xml:space="preserve">: </w:t>
+              <w:t>：</w:t>
             </w:r>
           </w:p>
         </w:tc>
@@ -1528,7 +1528,7 @@
                 <w:kern w:val="0"/>
                 <w:sz w:val="24"/>
               </w:rPr>
-              <w:t xml:space="preserve">Classification: </w:t>
+              <w:t>Classification：</w:t>
             </w:r>
           </w:p>
         </w:tc>
@@ -1684,7 +1684,7 @@
                 <w:kern w:val="0"/>
                 <w:sz w:val="24"/>
               </w:rPr>
-              <w:t xml:space="preserve">GHS Label Elements: </w:t>
+              <w:t>GHS Label Elements：</w:t>
             </w:r>
           </w:p>
         </w:tc>
@@ -1808,7 +1808,7 @@
                 <w:kern w:val="0"/>
                 <w:sz w:val="24"/>
               </w:rPr>
-              <w:t xml:space="preserve">GHS Pictograms: </w:t>
+              <w:t>GHS Pictograms：</w:t>
             </w:r>
           </w:p>
         </w:tc>
@@ -1968,7 +1968,7 @@
                 <w:kern w:val="0"/>
                 <w:sz w:val="24"/>
               </w:rPr>
-              <w:t xml:space="preserve">Signal Word: </w:t>
+              <w:t>Signal Word：</w:t>
             </w:r>
           </w:p>
         </w:tc>
@@ -2123,7 +2123,7 @@
                 <w:kern w:val="0"/>
                 <w:sz w:val="24"/>
               </w:rPr>
-              <w:t xml:space="preserve">Hazard Statements: </w:t>
+              <w:t>Hazard Statements：</w:t>
             </w:r>
           </w:p>
         </w:tc>
@@ -2275,7 +2275,7 @@
                 <w:b/>
                 <w:sz w:val="24"/>
               </w:rPr>
-              <w:t xml:space="preserve">Precautionary Statements: </w:t>
+              <w:t>Precautionary Statements：</w:t>
             </w:r>
           </w:p>
         </w:tc>
@@ -2450,7 +2450,7 @@
                 <w:kern w:val="0"/>
                 <w:sz w:val="24"/>
               </w:rPr>
-              <w:t xml:space="preserve">Physical and Chemical Hazards: </w:t>
+              <w:t>Physical and Chemical Hazards：</w:t>
             </w:r>
           </w:p>
         </w:tc>
@@ -2629,9 +2629,8 @@
                 <w:kern w:val="0"/>
                 <w:sz w:val="24"/>
                 <w:lang w:val="en-US" w:eastAsia="zh-CN"/>
-                <w:b/>
-              </w:rPr>
-              <w:t>Inhalation:</w:t>
+              </w:rPr>
+              <w:t>吸入：</w:t>
             </w:r>
           </w:p>
         </w:tc>
@@ -2745,9 +2744,8 @@
                 <w:kern w:val="0"/>
                 <w:sz w:val="24"/>
                 <w:lang w:val="en-US" w:eastAsia="zh-CN"/>
-                <w:b/>
-              </w:rPr>
-              <w:t>Ingestion:</w:t>
+              </w:rPr>
+              <w:t>食入：</w:t>
             </w:r>
           </w:p>
         </w:tc>
@@ -2861,9 +2859,8 @@
                 <w:kern w:val="0"/>
                 <w:sz w:val="24"/>
                 <w:lang w:val="en-US" w:eastAsia="zh-CN"/>
-                <w:b/>
-              </w:rPr>
-              <w:t>Skin:</w:t>
+              </w:rPr>
+              <w:t>皮肤：</w:t>
             </w:r>
           </w:p>
         </w:tc>
@@ -2977,9 +2974,8 @@
                 <w:kern w:val="0"/>
                 <w:sz w:val="24"/>
                 <w:lang w:val="en-US" w:eastAsia="zh-CN"/>
-                <w:b/>
-              </w:rPr>
-              <w:t>Eyes:</w:t>
+              </w:rPr>
+              <w:t>眼睛：</w:t>
             </w:r>
           </w:p>
         </w:tc>
@@ -3093,9 +3089,8 @@
                 <w:kern w:val="0"/>
                 <w:sz w:val="24"/>
                 <w:lang w:val="en-US" w:eastAsia="zh-CN"/>
-                <w:b/>
-              </w:rPr>
-              <w:t>Signs and symptoms:</w:t>
+              </w:rPr>
+              <w:t>症状和体征：</w:t>
             </w:r>
           </w:p>
         </w:tc>
@@ -3559,7 +3554,7 @@
                 <w:kern w:val="0"/>
                 <w:sz w:val="24"/>
               </w:rPr>
-              <w:t xml:space="preserve">Product type: </w:t>
+              <w:t>Product type：</w:t>
             </w:r>
           </w:p>
         </w:tc>
@@ -4437,7 +4432,7 @@
                 <w:b/>
                 <w:sz w:val="24"/>
               </w:rPr>
-              <w:t xml:space="preserve">General measures: </w:t>
+              <w:t>General measures：</w:t>
             </w:r>
           </w:p>
         </w:tc>
@@ -4560,7 +4555,7 @@
                 <w:b/>
                 <w:sz w:val="24"/>
               </w:rPr>
-              <w:t xml:space="preserve">Ingestion: </w:t>
+              <w:t>Ingestion：</w:t>
             </w:r>
           </w:p>
         </w:tc>
@@ -4692,7 +4687,7 @@
                 <w:b/>
                 <w:sz w:val="24"/>
               </w:rPr>
-              <w:t xml:space="preserve">Eye contact: </w:t>
+              <w:t>Eye contact：</w:t>
             </w:r>
           </w:p>
         </w:tc>
@@ -4816,7 +4811,7 @@
                 <w:b/>
                 <w:sz w:val="24"/>
               </w:rPr>
-              <w:t xml:space="preserve">Skin contact: </w:t>
+              <w:t>Skin contact：</w:t>
             </w:r>
           </w:p>
         </w:tc>
@@ -4942,7 +4937,7 @@
                 <w:b/>
                 <w:sz w:val="24"/>
               </w:rPr>
-              <w:t xml:space="preserve">Inhalation: </w:t>
+              <w:t>Inhalation：</w:t>
             </w:r>
           </w:p>
         </w:tc>
@@ -5214,7 +5209,7 @@
                 <w:b/>
                 <w:sz w:val="24"/>
               </w:rPr>
-              <w:t xml:space="preserve">agents: </w:t>
+              <w:t>agents：</w:t>
             </w:r>
           </w:p>
         </w:tc>
@@ -5444,7 +5439,7 @@
                 <w:b/>
                 <w:sz w:val="24"/>
               </w:rPr>
-              <w:t xml:space="preserve">agents: </w:t>
+              <w:t>agents：</w:t>
             </w:r>
           </w:p>
         </w:tc>
@@ -5639,7 +5634,7 @@
                 <w:sz w:val="24"/>
                 <w:lang w:val="en-US" w:eastAsia="zh-CN"/>
               </w:rPr>
-              <w:t xml:space="preserve">substances or mixtures: </w:t>
+              <w:t>substances or mixtures：</w:t>
             </w:r>
           </w:p>
         </w:tc>
@@ -5858,7 +5853,7 @@
                 <w:b/>
                 <w:sz w:val="24"/>
               </w:rPr>
-              <w:t xml:space="preserve">protective equipment: </w:t>
+              <w:t>protective equipment：</w:t>
             </w:r>
           </w:p>
         </w:tc>
@@ -6037,7 +6032,7 @@
                 <w:b/>
                 <w:sz w:val="24"/>
               </w:rPr>
-              <w:t xml:space="preserve"> Accidental release measures</w:t>
+              <w:t>Measures for accidental leakage</w:t>
             </w:r>
           </w:p>
         </w:tc>
@@ -6141,7 +6136,7 @@
                 <w:b/>
                 <w:sz w:val="24"/>
               </w:rPr>
-              <w:t>Personal precautions, protective equipment and</w:t>
+              <w:t>Firefighting precautions</w:t>
             </w:r>
           </w:p>
           <w:p>
@@ -6178,7 +6173,7 @@
                 <w:b/>
                 <w:sz w:val="24"/>
               </w:rPr>
-              <w:t>emergency procedures:</w:t>
+              <w:t>protective equipment：</w:t>
             </w:r>
           </w:p>
         </w:tc>
@@ -6380,7 +6375,7 @@
                 <w:b/>
                 <w:sz w:val="24"/>
               </w:rPr>
-              <w:t xml:space="preserve">precautions: </w:t>
+              <w:t>precautions：</w:t>
             </w:r>
           </w:p>
         </w:tc>
@@ -6535,7 +6530,7 @@
                 <w:b/>
                 <w:sz w:val="24"/>
               </w:rPr>
-              <w:t xml:space="preserve">containment and cleaning up: </w:t>
+              <w:t>containment and cleaning up：</w:t>
             </w:r>
           </w:p>
         </w:tc>
@@ -6679,7 +6674,7 @@
                 <w:b/>
                 <w:sz w:val="24"/>
               </w:rPr>
-              <w:t xml:space="preserve"> Handling and storage</w:t>
+              <w:t>Operation and storage</w:t>
             </w:r>
           </w:p>
         </w:tc>
@@ -6778,7 +6773,7 @@
                 <w:b/>
                 <w:sz w:val="24"/>
               </w:rPr>
-              <w:t xml:space="preserve">Precautions for safe handling: </w:t>
+              <w:t>Precautions for safe handling：</w:t>
             </w:r>
           </w:p>
         </w:tc>
@@ -6939,7 +6934,7 @@
                 <w:b/>
                 <w:sz w:val="24"/>
               </w:rPr>
-              <w:t xml:space="preserve">Conditions for safe storage: </w:t>
+              <w:t>Conditions for safe storage：</w:t>
             </w:r>
           </w:p>
         </w:tc>
@@ -7060,11 +7055,8 @@
         </w:tblCellMar>
       </w:tblPr>
       <w:tblGrid>
-        <w:gridCol w:w="3076"/>
-        <w:gridCol w:w="171"/>
-        <w:gridCol w:w="1683"/>
-        <w:gridCol w:w="2465"/>
-        <w:gridCol w:w="2465"/>
+        <w:gridCol w:w="3519"/>
+        <w:gridCol w:w="6341"/>
       </w:tblGrid>
       <w:tr>
         <w:tblPrEx>
@@ -7089,12 +7081,11 @@
         <w:tc>
           <w:tcPr>
             <w:tcW w:w="9860" w:type="dxa"/>
-            <w:gridSpan w:val="5"/>
-            <w:tcBorders>
-              <w:top w:val="single" w:color="auto" w:sz="4" w:space="0"/>
-              <w:left w:val="single" w:color="auto" w:sz="4" w:space="0"/>
-              <w:bottom w:val="dotted" w:color="auto" w:sz="4" w:space="0"/>
-              <w:right w:val="single" w:color="auto" w:sz="4" w:space="0"/>
+            <w:gridSpan w:val="2"/>
+            <w:tcBorders>
+              <w:bottom w:val="single" w:color="auto" w:sz="4" w:space="0"/>
+              <w:tl2br w:val="nil"/>
+              <w:tr2bl w:val="nil"/>
             </w:tcBorders>
             <w:shd w:val="clear" w:color="auto" w:fill="D9D9D9"/>
           </w:tcPr>
@@ -7156,11 +7147,11 @@
         <w:tc>
           <w:tcPr>
             <w:tcW w:w="9860" w:type="dxa"/>
-            <w:gridSpan w:val="5"/>
-            <w:tcBorders>
-              <w:top w:val="dotted" w:color="auto" w:sz="4" w:space="0"/>
+            <w:gridSpan w:val="2"/>
+            <w:tcBorders>
+              <w:top w:val="single" w:color="auto" w:sz="4" w:space="0"/>
               <w:left w:val="single" w:color="auto" w:sz="4" w:space="0"/>
-              <w:bottom w:val="dotted" w:color="auto" w:sz="4" w:space="0"/>
+              <w:bottom w:val="single" w:color="auto" w:sz="4" w:space="0"/>
               <w:right w:val="single" w:color="auto" w:sz="4" w:space="0"/>
             </w:tcBorders>
             <w:vAlign w:val="center"/>
@@ -7206,7 +7197,7 @@
                 <w:sz w:val="24"/>
                 <w:lang w:val="en-US" w:eastAsia="zh-CN"/>
               </w:rPr>
-              <w:t xml:space="preserve">Exposure controls: </w:t>
+              <w:t>Exposure controls：</w:t>
             </w:r>
           </w:p>
         </w:tc>
@@ -7233,10 +7224,9 @@
         </w:trPr>
         <w:tc>
           <w:tcPr>
-            <w:tcW w:w="3247" w:type="dxa"/>
-            <w:gridSpan w:val="2"/>
-            <w:tcBorders>
-              <w:top w:val="dotted" w:color="auto" w:sz="4" w:space="0"/>
+            <w:tcW w:w="3519" w:type="dxa"/>
+            <w:tcBorders>
+              <w:top w:val="single" w:color="auto" w:sz="4" w:space="0"/>
               <w:left w:val="single" w:color="auto" w:sz="4" w:space="0"/>
               <w:bottom w:val="dotted" w:color="auto" w:sz="4" w:space="0"/>
               <w:right w:val="dotted" w:color="auto" w:sz="4" w:space="0"/>
@@ -7271,16 +7261,15 @@
                 <w:b/>
                 <w:sz w:val="24"/>
               </w:rPr>
-              <w:t xml:space="preserve">Respiratory protection: </w:t>
-            </w:r>
-          </w:p>
-        </w:tc>
-        <w:tc>
-          <w:tcPr>
-            <w:tcW w:w="6613" w:type="dxa"/>
-            <w:gridSpan w:val="3"/>
-            <w:tcBorders>
-              <w:top w:val="dotted" w:color="auto" w:sz="4" w:space="0"/>
+              <w:t>Respiratory protection：</w:t>
+            </w:r>
+          </w:p>
+        </w:tc>
+        <w:tc>
+          <w:tcPr>
+            <w:tcW w:w="6341" w:type="dxa"/>
+            <w:tcBorders>
+              <w:top w:val="single" w:color="auto" w:sz="4" w:space="0"/>
               <w:left w:val="dotted" w:color="auto" w:sz="4" w:space="0"/>
               <w:bottom w:val="dotted" w:color="auto" w:sz="4" w:space="0"/>
               <w:right w:val="single" w:color="auto" w:sz="4" w:space="0"/>
@@ -7343,8 +7332,7 @@
         </w:trPr>
         <w:tc>
           <w:tcPr>
-            <w:tcW w:w="3247" w:type="dxa"/>
-            <w:gridSpan w:val="2"/>
+            <w:tcW w:w="3519" w:type="dxa"/>
             <w:tcBorders>
               <w:top w:val="dotted" w:color="auto" w:sz="4" w:space="0"/>
               <w:left w:val="single" w:color="auto" w:sz="4" w:space="0"/>
@@ -7384,13 +7372,14 @@
                 <w:b/>
                 <w:sz w:val="24"/>
               </w:rPr>
-              <w:t>Hand protection:</w:t>
-            </w:r>
-            <w:r>
-              <w:rPr>
-                <w:b/>
-                <w:sz w:val="24"/>
-              </w:rPr>
+              <w:t>Hand protection：</w:t>
+            </w:r>
+            <w:r>
+              <w:rPr>
+                <w:b/>
+                <w:sz w:val="24"/>
+              </w:rPr>
+              <w:tab/>
             </w:r>
             <w:r>
               <w:rPr>
@@ -7399,13 +7388,13 @@
                 <w:kern w:val="0"/>
                 <w:sz w:val="24"/>
               </w:rPr>
-            </w:r>
-          </w:p>
-        </w:tc>
-        <w:tc>
-          <w:tcPr>
-            <w:tcW w:w="6613" w:type="dxa"/>
-            <w:gridSpan w:val="3"/>
+              <w:t>喷涂过程中要求有呼吸防护设备。</w:t>
+            </w:r>
+          </w:p>
+        </w:tc>
+        <w:tc>
+          <w:tcPr>
+            <w:tcW w:w="6341" w:type="dxa"/>
             <w:tcBorders>
               <w:top w:val="dotted" w:color="auto" w:sz="4" w:space="0"/>
               <w:left w:val="dotted" w:color="auto" w:sz="4" w:space="0"/>
@@ -7475,8 +7464,7 @@
         </w:trPr>
         <w:tc>
           <w:tcPr>
-            <w:tcW w:w="3247" w:type="dxa"/>
-            <w:gridSpan w:val="2"/>
+            <w:tcW w:w="3519" w:type="dxa"/>
             <w:tcBorders>
               <w:top w:val="dotted" w:color="auto" w:sz="4" w:space="0"/>
               <w:left w:val="single" w:color="auto" w:sz="4" w:space="0"/>
@@ -7513,14 +7501,13 @@
                 <w:b/>
                 <w:sz w:val="24"/>
               </w:rPr>
-              <w:t xml:space="preserve">Suitable material for protective gloves: </w:t>
-            </w:r>
-          </w:p>
-        </w:tc>
-        <w:tc>
-          <w:tcPr>
-            <w:tcW w:w="6613" w:type="dxa"/>
-            <w:gridSpan w:val="3"/>
+              <w:t>Suitable material for protective gloves：</w:t>
+            </w:r>
+          </w:p>
+        </w:tc>
+        <w:tc>
+          <w:tcPr>
+            <w:tcW w:w="6341" w:type="dxa"/>
             <w:tcBorders>
               <w:top w:val="dotted" w:color="auto" w:sz="4" w:space="0"/>
               <w:left w:val="dotted" w:color="auto" w:sz="4" w:space="0"/>
@@ -7586,8 +7573,7 @@
         </w:trPr>
         <w:tc>
           <w:tcPr>
-            <w:tcW w:w="3247" w:type="dxa"/>
-            <w:gridSpan w:val="2"/>
+            <w:tcW w:w="3519" w:type="dxa"/>
             <w:tcBorders>
               <w:top w:val="dotted" w:color="auto" w:sz="4" w:space="0"/>
               <w:left w:val="single" w:color="auto" w:sz="4" w:space="0"/>
@@ -7631,8 +7617,7 @@
         </w:tc>
         <w:tc>
           <w:tcPr>
-            <w:tcW w:w="6613" w:type="dxa"/>
-            <w:gridSpan w:val="3"/>
+            <w:tcW w:w="6341" w:type="dxa"/>
             <w:tcBorders>
               <w:top w:val="dotted" w:color="auto" w:sz="4" w:space="0"/>
               <w:left w:val="dotted" w:color="auto" w:sz="4" w:space="0"/>
@@ -7722,8 +7707,7 @@
         </w:trPr>
         <w:tc>
           <w:tcPr>
-            <w:tcW w:w="3247" w:type="dxa"/>
-            <w:gridSpan w:val="2"/>
+            <w:tcW w:w="3519" w:type="dxa"/>
             <w:tcBorders>
               <w:top w:val="dotted" w:color="auto" w:sz="4" w:space="0"/>
               <w:left w:val="single" w:color="auto" w:sz="4" w:space="0"/>
@@ -7761,14 +7745,13 @@
                 <w:b/>
                 <w:sz w:val="24"/>
               </w:rPr>
-              <w:t xml:space="preserve">Butyl rubber – IIR: </w:t>
-            </w:r>
-          </w:p>
-        </w:tc>
-        <w:tc>
-          <w:tcPr>
-            <w:tcW w:w="6613" w:type="dxa"/>
-            <w:gridSpan w:val="3"/>
+              <w:t>Butyl rubber – IIR：</w:t>
+            </w:r>
+          </w:p>
+        </w:tc>
+        <w:tc>
+          <w:tcPr>
+            <w:tcW w:w="6341" w:type="dxa"/>
             <w:tcBorders>
               <w:top w:val="dotted" w:color="auto" w:sz="4" w:space="0"/>
               <w:left w:val="dotted" w:color="auto" w:sz="4" w:space="0"/>
@@ -7858,8 +7841,7 @@
         </w:trPr>
         <w:tc>
           <w:tcPr>
-            <w:tcW w:w="3247" w:type="dxa"/>
-            <w:gridSpan w:val="2"/>
+            <w:tcW w:w="3519" w:type="dxa"/>
             <w:tcBorders>
               <w:top w:val="dotted" w:color="auto" w:sz="4" w:space="0"/>
               <w:left w:val="single" w:color="auto" w:sz="4" w:space="0"/>
@@ -7897,14 +7879,13 @@
                 <w:b/>
                 <w:sz w:val="24"/>
               </w:rPr>
-              <w:t xml:space="preserve">Nitrile rubber – NBR: </w:t>
-            </w:r>
-          </w:p>
-        </w:tc>
-        <w:tc>
-          <w:tcPr>
-            <w:tcW w:w="6613" w:type="dxa"/>
-            <w:gridSpan w:val="3"/>
+              <w:t>Nitrile rubber – NBR：</w:t>
+            </w:r>
+          </w:p>
+        </w:tc>
+        <w:tc>
+          <w:tcPr>
+            <w:tcW w:w="6341" w:type="dxa"/>
             <w:tcBorders>
               <w:top w:val="dotted" w:color="auto" w:sz="4" w:space="0"/>
               <w:left w:val="dotted" w:color="auto" w:sz="4" w:space="0"/>
@@ -7994,8 +7975,7 @@
         </w:trPr>
         <w:tc>
           <w:tcPr>
-            <w:tcW w:w="3247" w:type="dxa"/>
-            <w:gridSpan w:val="2"/>
+            <w:tcW w:w="3519" w:type="dxa"/>
             <w:tcBorders>
               <w:top w:val="dotted" w:color="auto" w:sz="4" w:space="0"/>
               <w:left w:val="single" w:color="auto" w:sz="4" w:space="0"/>
@@ -8037,8 +8017,7 @@
         </w:tc>
         <w:tc>
           <w:tcPr>
-            <w:tcW w:w="6613" w:type="dxa"/>
-            <w:gridSpan w:val="3"/>
+            <w:tcW w:w="6341" w:type="dxa"/>
             <w:tcBorders>
               <w:top w:val="dotted" w:color="auto" w:sz="4" w:space="0"/>
               <w:left w:val="dotted" w:color="auto" w:sz="4" w:space="0"/>
@@ -8093,8 +8072,7 @@
         </w:trPr>
         <w:tc>
           <w:tcPr>
-            <w:tcW w:w="3247" w:type="dxa"/>
-            <w:gridSpan w:val="2"/>
+            <w:tcW w:w="3519" w:type="dxa"/>
             <w:tcBorders>
               <w:top w:val="dotted" w:color="auto" w:sz="4" w:space="0"/>
               <w:left w:val="single" w:color="auto" w:sz="4" w:space="0"/>
@@ -8131,14 +8109,13 @@
                 <w:b/>
                 <w:sz w:val="24"/>
               </w:rPr>
-              <w:t xml:space="preserve">Eye protection: </w:t>
-            </w:r>
-          </w:p>
-        </w:tc>
-        <w:tc>
-          <w:tcPr>
-            <w:tcW w:w="6613" w:type="dxa"/>
-            <w:gridSpan w:val="3"/>
+              <w:t>Eye protection：</w:t>
+            </w:r>
+          </w:p>
+        </w:tc>
+        <w:tc>
+          <w:tcPr>
+            <w:tcW w:w="6341" w:type="dxa"/>
             <w:tcBorders>
               <w:top w:val="dotted" w:color="auto" w:sz="4" w:space="0"/>
               <w:left w:val="dotted" w:color="auto" w:sz="4" w:space="0"/>
@@ -8219,8 +8196,7 @@
         </w:trPr>
         <w:tc>
           <w:tcPr>
-            <w:tcW w:w="3247" w:type="dxa"/>
-            <w:gridSpan w:val="2"/>
+            <w:tcW w:w="3519" w:type="dxa"/>
             <w:tcBorders>
               <w:top w:val="dotted" w:color="auto" w:sz="4" w:space="0"/>
               <w:left w:val="single" w:color="auto" w:sz="4" w:space="0"/>
@@ -8257,14 +8233,13 @@
                 <w:b/>
                 <w:sz w:val="24"/>
               </w:rPr>
-              <w:t xml:space="preserve">Body protection: </w:t>
-            </w:r>
-          </w:p>
-        </w:tc>
-        <w:tc>
-          <w:tcPr>
-            <w:tcW w:w="6613" w:type="dxa"/>
-            <w:gridSpan w:val="3"/>
+              <w:t>Body protection：</w:t>
+            </w:r>
+          </w:p>
+        </w:tc>
+        <w:tc>
+          <w:tcPr>
+            <w:tcW w:w="6341" w:type="dxa"/>
             <w:tcBorders>
               <w:top w:val="dotted" w:color="auto" w:sz="4" w:space="0"/>
               <w:left w:val="dotted" w:color="auto" w:sz="4" w:space="0"/>
@@ -8328,777 +8303,103 @@
         </w:trPr>
         <w:tc>
           <w:tcPr>
-            <w:tcW w:w="3247" w:type="dxa"/>
-            <w:gridSpan w:val="2"/>
-            <w:tcBorders>
-              <w:top w:val="dotted" w:color="auto" w:sz="4" w:space="0"/>
-              <w:left w:val="single" w:color="auto" w:sz="4" w:space="0"/>
-              <w:bottom w:val="dotted" w:color="auto" w:sz="4" w:space="0"/>
-              <w:right w:val="dotted" w:color="auto" w:sz="4" w:space="0"/>
-            </w:tcBorders>
-            <w:vAlign w:val="center"/>
-          </w:tcPr>
-          <w:p>
-            <w:pPr>
-              <w:keepNext w:val="0"/>
-              <w:keepLines w:val="0"/>
-              <w:pageBreakBefore w:val="0"/>
-              <w:widowControl w:val="0"/>
-              <w:kinsoku/>
-              <w:wordWrap/>
-              <w:overflowPunct/>
-              <w:topLinePunct w:val="0"/>
-              <w:bidi w:val="0"/>
-              <w:adjustRightInd/>
-              <w:snapToGrid/>
-              <w:spacing w:line="300" w:lineRule="auto"/>
-              <w:jc w:val="left"/>
-              <w:textAlignment w:val="auto"/>
-              <w:rPr>
-                <w:rFonts w:hint="eastAsia" w:hAnsi="Arial" w:cs="Arial"/>
-                <w:kern w:val="0"/>
-                <w:sz w:val="24"/>
-                <w:lang w:val="en-US" w:eastAsia="zh-CN"/>
-              </w:rPr>
-            </w:pPr>
-            <w:r>
-              <w:rPr>
-                <w:rFonts w:hint="eastAsia" w:hAnsi="Arial" w:cs="Times New Roman"/>
-                <w:b/>
-                <w:kern w:val="2"/>
-                <w:sz w:val="21"/>
-                <w:szCs w:val="21"/>
-                <w:lang w:val="en-US" w:eastAsia="zh-CN" w:bidi="ar-SA"/>
-              </w:rPr>
-              <w:t xml:space="preserve">8.2  </w:t>
-            </w:r>
-            <w:r>
-              <w:rPr>
-                <w:rFonts w:hint="eastAsia" w:hAnsi="Arial"/>
-                <w:b/>
-                <w:sz w:val="24"/>
-                <w:lang w:val="en-US" w:eastAsia="zh-CN"/>
-              </w:rPr>
-              <w:t xml:space="preserve">Engineering controls: </w:t>
-            </w:r>
-          </w:p>
-        </w:tc>
-        <w:tc>
-          <w:tcPr>
-            <w:tcW w:w="6613" w:type="dxa"/>
-            <w:gridSpan w:val="3"/>
-            <w:tcBorders>
-              <w:top w:val="dotted" w:color="auto" w:sz="4" w:space="0"/>
-              <w:left w:val="dotted" w:color="auto" w:sz="4" w:space="0"/>
-              <w:bottom w:val="dotted" w:color="auto" w:sz="4" w:space="0"/>
-              <w:right w:val="single" w:color="auto" w:sz="4" w:space="0"/>
-            </w:tcBorders>
-            <w:vAlign w:val="center"/>
-          </w:tcPr>
-          <w:p>
-            <w:pPr>
-              <w:keepNext w:val="0"/>
-              <w:keepLines w:val="0"/>
-              <w:pageBreakBefore w:val="0"/>
-              <w:widowControl w:val="0"/>
-              <w:kinsoku/>
-              <w:wordWrap/>
-              <w:overflowPunct/>
-              <w:topLinePunct w:val="0"/>
-              <w:bidi w:val="0"/>
-              <w:adjustRightInd/>
-              <w:snapToGrid/>
-              <w:spacing w:line="300" w:lineRule="auto"/>
-              <w:jc w:val="left"/>
-              <w:textAlignment w:val="auto"/>
-              <w:rPr>
-                <w:rFonts w:hint="default" w:hAnsi="Arial" w:cs="Times New Roman"/>
-                <w:b/>
-                <w:kern w:val="2"/>
-                <w:sz w:val="21"/>
-                <w:szCs w:val="21"/>
-                <w:lang w:val="en-US" w:eastAsia="zh-CN" w:bidi="ar-SA"/>
-              </w:rPr>
-            </w:pPr>
-            <w:r>
-              <w:rPr>
-                <w:rFonts w:hint="eastAsia" w:hAnsi="Arial" w:cs="Arial"/>
-                <w:kern w:val="0"/>
-                <w:sz w:val="24"/>
-              </w:rPr>
-              <w:t>使用局部排风或全面通风，保持工作场所空气中浓度低于职业接触限值；工作场所设置洗眼器与安全淋浴设施。</w:t>
-            </w:r>
-          </w:p>
-        </w:tc>
-      </w:tr>
-      <w:tr>
-        <w:tblPrEx>
-          <w:tblBorders>
-            <w:top w:val="dotted" w:color="auto" w:sz="4" w:space="0"/>
-            <w:left w:val="dotted" w:color="auto" w:sz="4" w:space="0"/>
-            <w:bottom w:val="dotted" w:color="auto" w:sz="4" w:space="0"/>
-            <w:right w:val="dotted" w:color="auto" w:sz="4" w:space="0"/>
-            <w:insideH w:val="none" w:color="auto" w:sz="0" w:space="0"/>
-            <w:insideV w:val="none" w:color="auto" w:sz="0" w:space="0"/>
-          </w:tblBorders>
-          <w:tblCellMar>
-            <w:top w:w="0" w:type="dxa"/>
-            <w:left w:w="108" w:type="dxa"/>
-            <w:bottom w:w="0" w:type="dxa"/>
-            <w:right w:w="108" w:type="dxa"/>
-          </w:tblCellMar>
-        </w:tblPrEx>
-        <w:trPr>
-          <w:trHeight w:val="244" w:hRule="atLeast"/>
-        </w:trPr>
-        <w:tc>
-          <w:tcPr>
-            <w:tcW w:w="9860" w:type="dxa"/>
-            <w:gridSpan w:val="5"/>
-            <w:tcBorders>
-              <w:top w:val="dotted" w:color="auto" w:sz="4" w:space="0"/>
-              <w:left w:val="single" w:color="auto" w:sz="4" w:space="0"/>
-              <w:bottom w:val="dotted" w:color="auto" w:sz="4" w:space="0"/>
-              <w:right w:val="single" w:color="auto" w:sz="4" w:space="0"/>
-            </w:tcBorders>
-            <w:shd w:val="clear" w:color="auto" w:fill="auto"/>
-            <w:vAlign w:val="center"/>
-          </w:tcPr>
-          <w:p>
-            <w:pPr>
-              <w:keepNext w:val="0"/>
-              <w:keepLines w:val="0"/>
-              <w:pageBreakBefore w:val="0"/>
-              <w:widowControl w:val="0"/>
-              <w:kinsoku/>
-              <w:wordWrap/>
-              <w:overflowPunct/>
-              <w:topLinePunct w:val="0"/>
-              <w:bidi w:val="0"/>
-              <w:adjustRightInd/>
-              <w:snapToGrid/>
-              <w:spacing w:line="300" w:lineRule="auto"/>
-              <w:jc w:val="left"/>
-              <w:textAlignment w:val="auto"/>
-              <w:rPr>
-                <w:rFonts w:hint="eastAsia" w:hAnsi="Arial" w:cs="Arial"/>
-                <w:kern w:val="0"/>
-                <w:sz w:val="24"/>
-              </w:rPr>
-            </w:pPr>
-            <w:r>
-              <w:rPr>
-                <w:rFonts w:hint="eastAsia" w:hAnsi="Arial"/>
-                <w:b/>
-                <w:sz w:val="24"/>
-                <w:lang w:val="en-US" w:eastAsia="zh-CN"/>
-              </w:rPr>
-              <w:t>Control parameters for workplace components</w:t>
-            </w:r>
-            <w:bookmarkStart w:id="0" w:name="_GoBack"/>
-            <w:bookmarkEnd w:id="0"/>
-          </w:p>
-        </w:tc>
-      </w:tr>
-      <w:tr>
-        <w:tblPrEx>
-          <w:tblBorders>
-            <w:top w:val="dotted" w:color="auto" w:sz="4" w:space="0"/>
-            <w:left w:val="dotted" w:color="auto" w:sz="4" w:space="0"/>
-            <w:bottom w:val="dotted" w:color="auto" w:sz="4" w:space="0"/>
-            <w:right w:val="dotted" w:color="auto" w:sz="4" w:space="0"/>
-            <w:insideH w:val="none" w:color="auto" w:sz="0" w:space="0"/>
-            <w:insideV w:val="none" w:color="auto" w:sz="0" w:space="0"/>
-          </w:tblBorders>
-          <w:tblCellMar>
-            <w:top w:w="0" w:type="dxa"/>
-            <w:left w:w="108" w:type="dxa"/>
-            <w:bottom w:w="0" w:type="dxa"/>
-            <w:right w:w="108" w:type="dxa"/>
-          </w:tblCellMar>
-        </w:tblPrEx>
-        <w:trPr>
-          <w:trHeight w:val="244" w:hRule="atLeast"/>
-        </w:trPr>
-        <w:tc>
-          <w:tcPr>
-            <w:tcW w:w="3076" w:type="dxa"/>
-            <w:tcBorders>
-              <w:top w:val="dotted" w:color="auto" w:sz="4" w:space="0"/>
-              <w:left w:val="single" w:color="auto" w:sz="4" w:space="0"/>
-              <w:bottom w:val="dotted" w:color="auto" w:sz="4" w:space="0"/>
-              <w:right w:val="dotted" w:color="auto" w:sz="4" w:space="0"/>
-            </w:tcBorders>
-            <w:shd w:val="clear" w:color="auto" w:fill="auto"/>
-            <w:vAlign w:val="center"/>
-          </w:tcPr>
-          <w:p>
-            <w:pPr>
-              <w:keepNext w:val="0"/>
-              <w:keepLines w:val="0"/>
-              <w:pageBreakBefore w:val="0"/>
-              <w:widowControl w:val="0"/>
-              <w:kinsoku/>
-              <w:wordWrap/>
-              <w:overflowPunct/>
-              <w:topLinePunct w:val="0"/>
-              <w:bidi w:val="0"/>
-              <w:adjustRightInd/>
-              <w:snapToGrid/>
-              <w:spacing w:line="300" w:lineRule="auto"/>
-              <w:jc w:val="left"/>
-              <w:textAlignment w:val="auto"/>
-              <w:rPr>
-                <w:rFonts w:hint="eastAsia" w:hAnsi="Arial"/>
-                <w:b/>
-                <w:sz w:val="24"/>
-                <w:lang w:val="en-US" w:eastAsia="zh-CN"/>
-              </w:rPr>
-            </w:pPr>
-            <w:r>
-              <w:rPr>
-                <w:rFonts w:hint="eastAsia" w:hAnsi="Arial"/>
-                <w:b/>
-                <w:sz w:val="24"/>
-                <w:lang w:val="en-US" w:eastAsia="zh-CN"/>
-              </w:rPr>
-              <w:t>Substance</w:t>
-            </w:r>
-          </w:p>
-        </w:tc>
-        <w:tc>
-          <w:tcPr>
-            <w:tcW w:w="1854" w:type="dxa"/>
-            <w:gridSpan w:val="2"/>
-            <w:tcBorders>
-              <w:top w:val="dotted" w:color="auto" w:sz="4" w:space="0"/>
-              <w:left w:val="dotted" w:color="auto" w:sz="4" w:space="0"/>
-              <w:bottom w:val="dotted" w:color="auto" w:sz="4" w:space="0"/>
-              <w:right w:val="dotted" w:color="auto" w:sz="4" w:space="0"/>
-            </w:tcBorders>
-            <w:shd w:val="clear" w:color="auto" w:fill="auto"/>
-            <w:vAlign w:val="center"/>
-          </w:tcPr>
-          <w:p>
-            <w:pPr>
-              <w:keepNext w:val="0"/>
-              <w:keepLines w:val="0"/>
-              <w:pageBreakBefore w:val="0"/>
-              <w:widowControl w:val="0"/>
-              <w:kinsoku/>
-              <w:wordWrap/>
-              <w:overflowPunct/>
-              <w:topLinePunct w:val="0"/>
-              <w:bidi w:val="0"/>
-              <w:adjustRightInd/>
-              <w:snapToGrid/>
-              <w:spacing w:line="300" w:lineRule="auto"/>
-              <w:jc w:val="left"/>
-              <w:textAlignment w:val="auto"/>
-              <w:rPr>
-                <w:rFonts w:hint="eastAsia" w:hAnsi="Arial"/>
-                <w:b/>
-                <w:sz w:val="24"/>
-                <w:lang w:val="en-US" w:eastAsia="zh-CN"/>
-              </w:rPr>
-            </w:pPr>
-            <w:r>
-              <w:rPr>
-                <w:rFonts w:hint="eastAsia" w:hAnsi="Arial"/>
-                <w:b/>
-                <w:sz w:val="24"/>
-                <w:lang w:val="en-US" w:eastAsia="zh-CN"/>
-              </w:rPr>
-              <w:t>Basis</w:t>
-            </w:r>
-          </w:p>
-        </w:tc>
-        <w:tc>
-          <w:tcPr>
-            <w:tcW w:w="2465" w:type="dxa"/>
-            <w:tcBorders>
-              <w:top w:val="dotted" w:color="auto" w:sz="4" w:space="0"/>
-              <w:left w:val="dotted" w:color="auto" w:sz="4" w:space="0"/>
-              <w:bottom w:val="dotted" w:color="auto" w:sz="4" w:space="0"/>
-              <w:right w:val="dotted" w:color="auto" w:sz="4" w:space="0"/>
-            </w:tcBorders>
-            <w:shd w:val="clear" w:color="auto" w:fill="auto"/>
-            <w:vAlign w:val="center"/>
-          </w:tcPr>
-          <w:p>
-            <w:pPr>
-              <w:keepNext w:val="0"/>
-              <w:keepLines w:val="0"/>
-              <w:pageBreakBefore w:val="0"/>
-              <w:widowControl w:val="0"/>
-              <w:kinsoku/>
-              <w:wordWrap/>
-              <w:overflowPunct/>
-              <w:topLinePunct w:val="0"/>
-              <w:bidi w:val="0"/>
-              <w:adjustRightInd/>
-              <w:snapToGrid/>
-              <w:spacing w:line="300" w:lineRule="auto"/>
-              <w:jc w:val="left"/>
-              <w:textAlignment w:val="auto"/>
-              <w:rPr>
-                <w:rFonts w:hint="eastAsia" w:hAnsi="Arial"/>
-                <w:b/>
-                <w:sz w:val="24"/>
-                <w:lang w:val="en-US" w:eastAsia="zh-CN"/>
-              </w:rPr>
-            </w:pPr>
-            <w:r>
-              <w:rPr>
-                <w:rFonts w:hint="eastAsia" w:hAnsi="Arial"/>
-                <w:b/>
-                <w:sz w:val="24"/>
-                <w:lang w:val="en-US" w:eastAsia="zh-CN"/>
-              </w:rPr>
-              <w:t>Type</w:t>
-            </w:r>
-          </w:p>
-        </w:tc>
-        <w:tc>
-          <w:tcPr>
-            <w:tcW w:w="2465" w:type="dxa"/>
-            <w:tcBorders>
-              <w:top w:val="dotted" w:color="auto" w:sz="4" w:space="0"/>
-              <w:left w:val="dotted" w:color="auto" w:sz="4" w:space="0"/>
-              <w:bottom w:val="dotted" w:color="auto" w:sz="4" w:space="0"/>
-              <w:right w:val="single" w:color="auto" w:sz="4" w:space="0"/>
-            </w:tcBorders>
-            <w:shd w:val="clear" w:color="auto" w:fill="auto"/>
-            <w:vAlign w:val="center"/>
-          </w:tcPr>
-          <w:p>
-            <w:pPr>
-              <w:keepNext w:val="0"/>
-              <w:keepLines w:val="0"/>
-              <w:pageBreakBefore w:val="0"/>
-              <w:widowControl w:val="0"/>
-              <w:kinsoku/>
-              <w:wordWrap/>
-              <w:overflowPunct/>
-              <w:topLinePunct w:val="0"/>
-              <w:bidi w:val="0"/>
-              <w:adjustRightInd/>
-              <w:snapToGrid/>
-              <w:spacing w:line="300" w:lineRule="auto"/>
-              <w:jc w:val="left"/>
-              <w:textAlignment w:val="auto"/>
-              <w:rPr>
-                <w:rFonts w:hint="eastAsia" w:hAnsi="Arial"/>
-                <w:b/>
-                <w:sz w:val="24"/>
-                <w:lang w:val="en-US" w:eastAsia="zh-CN"/>
-              </w:rPr>
-            </w:pPr>
-            <w:r>
-              <w:rPr>
-                <w:rFonts w:hint="eastAsia" w:hAnsi="Arial"/>
-                <w:b/>
-                <w:sz w:val="24"/>
-                <w:lang w:val="en-US" w:eastAsia="zh-CN"/>
-              </w:rPr>
-              <w:t>Value</w:t>
-            </w:r>
-          </w:p>
-        </w:tc>
-      </w:tr>
-      <w:tr>
-        <w:tblPrEx>
-          <w:tblBorders>
-            <w:top w:val="dotted" w:color="auto" w:sz="4" w:space="0"/>
-            <w:left w:val="dotted" w:color="auto" w:sz="4" w:space="0"/>
-            <w:bottom w:val="dotted" w:color="auto" w:sz="4" w:space="0"/>
-            <w:right w:val="dotted" w:color="auto" w:sz="4" w:space="0"/>
-            <w:insideH w:val="none" w:color="auto" w:sz="0" w:space="0"/>
-            <w:insideV w:val="none" w:color="auto" w:sz="0" w:space="0"/>
-          </w:tblBorders>
-          <w:tblCellMar>
-            <w:top w:w="0" w:type="dxa"/>
-            <w:left w:w="108" w:type="dxa"/>
-            <w:bottom w:w="0" w:type="dxa"/>
-            <w:right w:w="108" w:type="dxa"/>
-          </w:tblCellMar>
-        </w:tblPrEx>
-        <w:trPr>
-          <w:trHeight w:val="244" w:hRule="atLeast"/>
-        </w:trPr>
-        <w:tc>
-          <w:tcPr>
-            <w:tcW w:w="3076" w:type="dxa"/>
-            <w:tcBorders>
-              <w:top w:val="dotted" w:color="auto" w:sz="4" w:space="0"/>
-              <w:left w:val="single" w:color="auto" w:sz="4" w:space="0"/>
-              <w:bottom w:val="dotted" w:color="auto" w:sz="4" w:space="0"/>
-              <w:right w:val="dotted" w:color="auto" w:sz="4" w:space="0"/>
-            </w:tcBorders>
-            <w:shd w:val="clear" w:color="auto" w:fill="auto"/>
-            <w:vAlign w:val="top"/>
-          </w:tcPr>
-          <w:p>
-            <w:pPr>
-              <w:spacing w:line="300" w:lineRule="auto"/>
-              <w:rPr>
-                <w:rFonts w:hint="eastAsia" w:ascii="Times New Roman" w:hAnsi="Times New Roman" w:eastAsia="宋体" w:cs="Times New Roman"/>
-                <w:kern w:val="2"/>
-                <w:sz w:val="24"/>
-                <w:szCs w:val="24"/>
-                <w:lang w:val="en-US" w:eastAsia="zh-CN" w:bidi="ar-SA"/>
-              </w:rPr>
-            </w:pPr>
-            <w:r>
-              <w:rPr>
-                <w:rFonts w:hint="eastAsia"/>
-                <w:sz w:val="24"/>
-              </w:rPr>
-              <w:t>六亚甲基-</w:t>
-            </w:r>
-            <w:r>
-              <w:rPr>
-                <w:sz w:val="24"/>
-              </w:rPr>
-              <w:t>1</w:t>
-            </w:r>
-            <w:r>
-              <w:rPr>
-                <w:rFonts w:hint="eastAsia"/>
-                <w:sz w:val="24"/>
-              </w:rPr>
-              <w:t>,</w:t>
-            </w:r>
-            <w:r>
-              <w:rPr>
-                <w:sz w:val="24"/>
-              </w:rPr>
-              <w:t>6</w:t>
-            </w:r>
-            <w:r>
-              <w:rPr>
-                <w:rFonts w:hint="eastAsia"/>
-                <w:sz w:val="24"/>
-              </w:rPr>
-              <w:t>-二异氰酸酯</w:t>
-            </w:r>
-          </w:p>
-        </w:tc>
-        <w:tc>
-          <w:tcPr>
-            <w:tcW w:w="1854" w:type="dxa"/>
-            <w:gridSpan w:val="2"/>
-            <w:tcBorders>
-              <w:top w:val="dotted" w:color="auto" w:sz="4" w:space="0"/>
-              <w:left w:val="dotted" w:color="auto" w:sz="4" w:space="0"/>
-              <w:bottom w:val="dotted" w:color="auto" w:sz="4" w:space="0"/>
-              <w:right w:val="dotted" w:color="auto" w:sz="4" w:space="0"/>
-            </w:tcBorders>
-            <w:shd w:val="clear" w:color="auto" w:fill="auto"/>
-            <w:vAlign w:val="top"/>
-          </w:tcPr>
-          <w:p>
-            <w:pPr>
-              <w:spacing w:line="300" w:lineRule="auto"/>
-              <w:rPr>
-                <w:rFonts w:hint="eastAsia" w:ascii="Times New Roman" w:hAnsi="Times New Roman" w:eastAsia="宋体" w:cs="Times New Roman"/>
-                <w:kern w:val="2"/>
-                <w:sz w:val="24"/>
-                <w:szCs w:val="24"/>
-                <w:lang w:val="en-US" w:eastAsia="zh-CN" w:bidi="ar-SA"/>
-              </w:rPr>
-            </w:pPr>
-            <w:r>
-              <w:rPr>
-                <w:rFonts w:hint="eastAsia"/>
-                <w:sz w:val="24"/>
-              </w:rPr>
-              <w:t>CN</w:t>
-            </w:r>
-            <w:r>
-              <w:rPr>
-                <w:sz w:val="24"/>
-              </w:rPr>
-              <w:t xml:space="preserve"> </w:t>
-            </w:r>
-            <w:r>
-              <w:rPr>
-                <w:rFonts w:hint="eastAsia"/>
-                <w:sz w:val="24"/>
-              </w:rPr>
-              <w:t>OEL</w:t>
-            </w:r>
-          </w:p>
-        </w:tc>
-        <w:tc>
-          <w:tcPr>
-            <w:tcW w:w="2465" w:type="dxa"/>
-            <w:tcBorders>
-              <w:top w:val="dotted" w:color="auto" w:sz="4" w:space="0"/>
-              <w:left w:val="dotted" w:color="auto" w:sz="4" w:space="0"/>
-              <w:bottom w:val="dotted" w:color="auto" w:sz="4" w:space="0"/>
-              <w:right w:val="dotted" w:color="auto" w:sz="4" w:space="0"/>
-            </w:tcBorders>
-            <w:shd w:val="clear" w:color="auto" w:fill="auto"/>
-            <w:vAlign w:val="top"/>
-          </w:tcPr>
-          <w:p>
-            <w:pPr>
-              <w:spacing w:line="300" w:lineRule="auto"/>
-              <w:rPr>
-                <w:rFonts w:hint="eastAsia" w:ascii="Times New Roman" w:hAnsi="Times New Roman" w:eastAsia="宋体" w:cs="Times New Roman"/>
-                <w:kern w:val="2"/>
-                <w:sz w:val="24"/>
-                <w:szCs w:val="24"/>
-                <w:lang w:val="en-US" w:eastAsia="zh-CN" w:bidi="ar-SA"/>
-              </w:rPr>
-            </w:pPr>
-            <w:r>
-              <w:rPr>
-                <w:rFonts w:hint="eastAsia"/>
-                <w:sz w:val="24"/>
-              </w:rPr>
-              <w:t>TWA</w:t>
-            </w:r>
-          </w:p>
-        </w:tc>
-        <w:tc>
-          <w:tcPr>
-            <w:tcW w:w="2465" w:type="dxa"/>
-            <w:tcBorders>
-              <w:top w:val="dotted" w:color="auto" w:sz="4" w:space="0"/>
-              <w:left w:val="dotted" w:color="auto" w:sz="4" w:space="0"/>
-              <w:bottom w:val="dotted" w:color="auto" w:sz="4" w:space="0"/>
-              <w:right w:val="single" w:color="auto" w:sz="4" w:space="0"/>
-            </w:tcBorders>
-            <w:shd w:val="clear" w:color="auto" w:fill="auto"/>
-            <w:vAlign w:val="top"/>
-          </w:tcPr>
-          <w:p>
-            <w:pPr>
-              <w:spacing w:line="300" w:lineRule="auto"/>
-              <w:rPr>
-                <w:rFonts w:hint="eastAsia" w:ascii="Times New Roman" w:hAnsi="Times New Roman" w:eastAsia="宋体" w:cs="Times New Roman"/>
-                <w:kern w:val="2"/>
-                <w:sz w:val="24"/>
-                <w:szCs w:val="24"/>
-                <w:lang w:val="en-US" w:eastAsia="zh-CN" w:bidi="ar-SA"/>
-              </w:rPr>
-            </w:pPr>
-            <w:r>
-              <w:rPr>
-                <w:rFonts w:hint="eastAsia"/>
-                <w:sz w:val="24"/>
-              </w:rPr>
-              <w:t>0</w:t>
-            </w:r>
-            <w:r>
-              <w:rPr>
-                <w:sz w:val="24"/>
-              </w:rPr>
-              <w:t xml:space="preserve">.03 </w:t>
-            </w:r>
-            <w:r>
-              <w:rPr>
-                <w:rFonts w:hint="eastAsia"/>
-                <w:sz w:val="24"/>
-              </w:rPr>
-              <w:t>mg</w:t>
-            </w:r>
-            <w:r>
-              <w:rPr>
-                <w:sz w:val="24"/>
-              </w:rPr>
-              <w:t>/m</w:t>
-            </w:r>
-            <w:r>
-              <w:rPr>
-                <w:sz w:val="24"/>
-                <w:vertAlign w:val="superscript"/>
-              </w:rPr>
-              <w:t>3</w:t>
-            </w:r>
-          </w:p>
-        </w:tc>
-      </w:tr>
-      <w:tr>
-        <w:tblPrEx>
-          <w:tblBorders>
-            <w:top w:val="dotted" w:color="auto" w:sz="4" w:space="0"/>
-            <w:left w:val="dotted" w:color="auto" w:sz="4" w:space="0"/>
-            <w:bottom w:val="dotted" w:color="auto" w:sz="4" w:space="0"/>
-            <w:right w:val="dotted" w:color="auto" w:sz="4" w:space="0"/>
-            <w:insideH w:val="none" w:color="auto" w:sz="0" w:space="0"/>
-            <w:insideV w:val="none" w:color="auto" w:sz="0" w:space="0"/>
-          </w:tblBorders>
-          <w:tblCellMar>
-            <w:top w:w="0" w:type="dxa"/>
-            <w:left w:w="108" w:type="dxa"/>
-            <w:bottom w:w="0" w:type="dxa"/>
-            <w:right w:w="108" w:type="dxa"/>
-          </w:tblCellMar>
-        </w:tblPrEx>
-        <w:trPr>
-          <w:trHeight w:val="244" w:hRule="atLeast"/>
-        </w:trPr>
-        <w:tc>
-          <w:tcPr>
-            <w:tcW w:w="3076" w:type="dxa"/>
+            <w:tcW w:w="3519" w:type="dxa"/>
             <w:tcBorders>
               <w:top w:val="dotted" w:color="auto" w:sz="4" w:space="0"/>
               <w:left w:val="single" w:color="auto" w:sz="4" w:space="0"/>
               <w:bottom w:val="single" w:color="auto" w:sz="4" w:space="0"/>
               <w:right w:val="dotted" w:color="auto" w:sz="4" w:space="0"/>
             </w:tcBorders>
-            <w:shd w:val="clear" w:color="auto" w:fill="auto"/>
-            <w:vAlign w:val="top"/>
-          </w:tcPr>
-          <w:p>
-            <w:pPr>
-              <w:spacing w:line="300" w:lineRule="auto"/>
-              <w:rPr>
-                <w:rFonts w:hint="eastAsia" w:ascii="Times New Roman" w:hAnsi="Times New Roman" w:eastAsia="宋体" w:cs="Times New Roman"/>
-                <w:kern w:val="2"/>
-                <w:sz w:val="24"/>
-                <w:szCs w:val="24"/>
-                <w:lang w:val="en-US" w:eastAsia="zh-CN" w:bidi="ar-SA"/>
-              </w:rPr>
-            </w:pPr>
-            <w:r>
-              <w:rPr>
-                <w:rFonts w:hint="eastAsia"/>
-                <w:sz w:val="24"/>
-              </w:rPr>
-              <w:t>丙二醇甲醚醋酸酯</w:t>
-            </w:r>
-          </w:p>
-        </w:tc>
-        <w:tc>
-          <w:tcPr>
-            <w:tcW w:w="1854" w:type="dxa"/>
-            <w:gridSpan w:val="2"/>
-            <w:tcBorders>
-              <w:top w:val="dotted" w:color="auto" w:sz="4" w:space="0"/>
-              <w:left w:val="dotted" w:color="auto" w:sz="4" w:space="0"/>
-              <w:bottom w:val="single" w:color="auto" w:sz="4" w:space="0"/>
-              <w:right w:val="dotted" w:color="auto" w:sz="4" w:space="0"/>
-            </w:tcBorders>
-            <w:shd w:val="clear" w:color="auto" w:fill="auto"/>
-            <w:vAlign w:val="top"/>
-          </w:tcPr>
-          <w:p>
-            <w:pPr>
-              <w:spacing w:line="300" w:lineRule="auto"/>
-              <w:rPr>
-                <w:rFonts w:hint="eastAsia" w:ascii="Times New Roman" w:hAnsi="Times New Roman" w:eastAsia="宋体" w:cs="Times New Roman"/>
-                <w:kern w:val="2"/>
-                <w:sz w:val="24"/>
-                <w:szCs w:val="24"/>
-                <w:lang w:val="en-US" w:eastAsia="zh-CN" w:bidi="ar-SA"/>
-              </w:rPr>
-            </w:pPr>
-            <w:r>
-              <w:rPr>
-                <w:rFonts w:hint="eastAsia"/>
-                <w:sz w:val="24"/>
-              </w:rPr>
-              <w:t>CN</w:t>
-            </w:r>
-            <w:r>
-              <w:rPr>
-                <w:sz w:val="24"/>
-              </w:rPr>
-              <w:t xml:space="preserve"> </w:t>
-            </w:r>
-            <w:r>
-              <w:rPr>
-                <w:rFonts w:hint="eastAsia"/>
-                <w:sz w:val="24"/>
-              </w:rPr>
-              <w:t>OEL</w:t>
-            </w:r>
-          </w:p>
-        </w:tc>
-        <w:tc>
-          <w:tcPr>
-            <w:tcW w:w="2465" w:type="dxa"/>
-            <w:tcBorders>
-              <w:top w:val="dotted" w:color="auto" w:sz="4" w:space="0"/>
-              <w:left w:val="dotted" w:color="auto" w:sz="4" w:space="0"/>
-              <w:bottom w:val="single" w:color="auto" w:sz="4" w:space="0"/>
-              <w:right w:val="dotted" w:color="auto" w:sz="4" w:space="0"/>
-            </w:tcBorders>
-            <w:shd w:val="clear" w:color="auto" w:fill="auto"/>
-            <w:vAlign w:val="top"/>
-          </w:tcPr>
-          <w:p>
-            <w:pPr>
-              <w:spacing w:line="300" w:lineRule="auto"/>
-              <w:rPr>
-                <w:rFonts w:hint="eastAsia" w:ascii="Times New Roman" w:hAnsi="Times New Roman" w:eastAsia="宋体" w:cs="Times New Roman"/>
-                <w:kern w:val="2"/>
-                <w:sz w:val="24"/>
-                <w:szCs w:val="24"/>
-                <w:lang w:val="en-US" w:eastAsia="zh-CN" w:bidi="ar-SA"/>
-              </w:rPr>
-            </w:pPr>
-            <w:r>
-              <w:rPr>
-                <w:rFonts w:hint="eastAsia"/>
-                <w:sz w:val="24"/>
-              </w:rPr>
-              <w:t>TWA</w:t>
-            </w:r>
-          </w:p>
-        </w:tc>
-        <w:tc>
-          <w:tcPr>
-            <w:tcW w:w="2465" w:type="dxa"/>
+            <w:vAlign w:val="center"/>
+          </w:tcPr>
+          <w:p>
+            <w:pPr>
+              <w:keepNext w:val="0"/>
+              <w:keepLines w:val="0"/>
+              <w:pageBreakBefore w:val="0"/>
+              <w:widowControl w:val="0"/>
+              <w:kinsoku/>
+              <w:wordWrap/>
+              <w:overflowPunct/>
+              <w:topLinePunct w:val="0"/>
+              <w:bidi w:val="0"/>
+              <w:adjustRightInd/>
+              <w:snapToGrid/>
+              <w:spacing w:line="300" w:lineRule="auto"/>
+              <w:jc w:val="left"/>
+              <w:textAlignment w:val="auto"/>
+              <w:rPr>
+                <w:rFonts w:hint="eastAsia" w:hAnsi="Arial" w:cs="Arial"/>
+                <w:kern w:val="0"/>
+                <w:sz w:val="24"/>
+                <w:lang w:val="en-US" w:eastAsia="zh-CN"/>
+              </w:rPr>
+            </w:pPr>
+            <w:r>
+              <w:rPr>
+                <w:rFonts w:hint="eastAsia" w:hAnsi="Arial" w:cs="Times New Roman"/>
+                <w:b/>
+                <w:kern w:val="2"/>
+                <w:sz w:val="21"/>
+                <w:szCs w:val="21"/>
+                <w:lang w:val="en-US" w:eastAsia="zh-CN" w:bidi="ar-SA"/>
+              </w:rPr>
+              <w:t xml:space="preserve">8.2  </w:t>
+            </w:r>
+            <w:r>
+              <w:rPr>
+                <w:rFonts w:hint="eastAsia" w:hAnsi="Arial"/>
+                <w:b/>
+                <w:sz w:val="24"/>
+                <w:lang w:val="en-US" w:eastAsia="zh-CN"/>
+              </w:rPr>
+              <w:t>Engineering controls：</w:t>
+            </w:r>
+          </w:p>
+        </w:tc>
+        <w:tc>
+          <w:tcPr>
+            <w:tcW w:w="6341" w:type="dxa"/>
             <w:tcBorders>
               <w:top w:val="dotted" w:color="auto" w:sz="4" w:space="0"/>
               <w:left w:val="dotted" w:color="auto" w:sz="4" w:space="0"/>
               <w:bottom w:val="single" w:color="auto" w:sz="4" w:space="0"/>
               <w:right w:val="single" w:color="auto" w:sz="4" w:space="0"/>
             </w:tcBorders>
-            <w:shd w:val="clear" w:color="auto" w:fill="auto"/>
-            <w:vAlign w:val="top"/>
-          </w:tcPr>
-          <w:p>
-            <w:pPr>
-              <w:spacing w:line="300" w:lineRule="auto"/>
-              <w:rPr>
-                <w:rFonts w:hint="eastAsia" w:ascii="Times New Roman" w:hAnsi="Times New Roman" w:eastAsia="宋体" w:cs="Times New Roman"/>
-                <w:kern w:val="2"/>
-                <w:sz w:val="24"/>
-                <w:szCs w:val="24"/>
-                <w:lang w:val="en-US" w:eastAsia="zh-CN" w:bidi="ar-SA"/>
-              </w:rPr>
-            </w:pPr>
-            <w:r>
-              <w:rPr>
-                <w:sz w:val="24"/>
-              </w:rPr>
-              <w:t xml:space="preserve">100 </w:t>
-            </w:r>
-            <w:r>
-              <w:rPr>
-                <w:rFonts w:hint="eastAsia"/>
-                <w:sz w:val="24"/>
-              </w:rPr>
-              <w:t>mg</w:t>
-            </w:r>
-            <w:r>
-              <w:rPr>
-                <w:sz w:val="24"/>
-              </w:rPr>
-              <w:t>/m</w:t>
-            </w:r>
-            <w:r>
-              <w:rPr>
-                <w:sz w:val="24"/>
-                <w:vertAlign w:val="superscript"/>
-              </w:rPr>
-              <w:t>3</w:t>
+            <w:vAlign w:val="center"/>
+          </w:tcPr>
+          <w:p>
+            <w:pPr>
+              <w:keepNext w:val="0"/>
+              <w:keepLines w:val="0"/>
+              <w:pageBreakBefore w:val="0"/>
+              <w:widowControl w:val="0"/>
+              <w:kinsoku/>
+              <w:wordWrap/>
+              <w:overflowPunct/>
+              <w:topLinePunct w:val="0"/>
+              <w:bidi w:val="0"/>
+              <w:adjustRightInd/>
+              <w:snapToGrid/>
+              <w:spacing w:line="300" w:lineRule="auto"/>
+              <w:jc w:val="left"/>
+              <w:textAlignment w:val="auto"/>
+              <w:rPr>
+                <w:rFonts w:hint="default" w:hAnsi="Arial" w:cs="Times New Roman"/>
+                <w:b/>
+                <w:kern w:val="2"/>
+                <w:sz w:val="21"/>
+                <w:szCs w:val="21"/>
+                <w:lang w:val="en-US" w:eastAsia="zh-CN" w:bidi="ar-SA"/>
+              </w:rPr>
+            </w:pPr>
+            <w:r>
+              <w:rPr>
+                <w:rFonts w:hint="eastAsia" w:hAnsi="Arial" w:cs="Arial"/>
+                <w:kern w:val="0"/>
+                <w:sz w:val="24"/>
+              </w:rPr>
+              <w:t>使用局部排风或全面通风，保持工作场所空气中浓度低于职业接触限值；工作场所设置洗眼器与安全淋浴设施。</w:t>
             </w:r>
           </w:p>
         </w:tc>
@@ -9295,7 +8596,7 @@
                 <w:sz w:val="24"/>
                 <w:lang w:val="en-US" w:eastAsia="zh-CN"/>
               </w:rPr>
-              <w:t xml:space="preserve">Appearance: </w:t>
+              <w:t>Appearance：</w:t>
             </w:r>
           </w:p>
         </w:tc>
@@ -9433,7 +8734,7 @@
                 <w:sz w:val="24"/>
                 <w:lang w:val="en-US" w:eastAsia="zh-CN"/>
               </w:rPr>
-              <w:t xml:space="preserve">Odour threshold:     </w:t>
+              <w:t xml:space="preserve">Odour threshold：    </w:t>
             </w:r>
             <w:r>
               <w:rPr>
@@ -9580,7 +8881,7 @@
                 <w:sz w:val="24"/>
                 <w:lang w:val="en-US" w:eastAsia="zh-CN"/>
               </w:rPr>
-              <w:t xml:space="preserve">pH value: </w:t>
+              <w:t>pH value：</w:t>
             </w:r>
           </w:p>
         </w:tc>
@@ -9719,7 +9020,7 @@
                 <w:sz w:val="24"/>
                 <w:lang w:val="en-US" w:eastAsia="zh-CN"/>
               </w:rPr>
-              <w:t xml:space="preserve">Ionicity: </w:t>
+              <w:t>Ionicity：</w:t>
             </w:r>
           </w:p>
         </w:tc>
@@ -9860,7 +9161,7 @@
                 <w:sz w:val="24"/>
                 <w:lang w:val="en-US" w:eastAsia="zh-CN"/>
               </w:rPr>
-              <w:t xml:space="preserve">Initial boiling point: </w:t>
+              <w:t>Initial boiling point：</w:t>
             </w:r>
           </w:p>
         </w:tc>
@@ -9996,7 +9297,7 @@
                 <w:sz w:val="24"/>
                 <w:lang w:val="en-US" w:eastAsia="zh-CN"/>
               </w:rPr>
-              <w:t xml:space="preserve">Flash point:    </w:t>
+              <w:t xml:space="preserve">Flash point：   </w:t>
             </w:r>
             <w:r>
               <w:rPr>
@@ -10143,7 +9444,7 @@
                 <w:sz w:val="24"/>
                 <w:lang w:val="en-US" w:eastAsia="zh-CN"/>
               </w:rPr>
-              <w:t xml:space="preserve">Evaporation rate:     </w:t>
+              <w:t xml:space="preserve">Evaporation rate：    </w:t>
             </w:r>
             <w:r>
               <w:rPr>
@@ -10301,7 +9602,7 @@
                 <w:sz w:val="24"/>
                 <w:lang w:val="en-US" w:eastAsia="zh-CN"/>
               </w:rPr>
-              <w:t xml:space="preserve">Flammability: </w:t>
+              <w:t>Flammability：</w:t>
             </w:r>
           </w:p>
         </w:tc>
@@ -10426,7 +9727,7 @@
                 <w:sz w:val="24"/>
                 <w:lang w:val="en-US" w:eastAsia="zh-CN"/>
               </w:rPr>
-              <w:t xml:space="preserve">Heat of combustion:       </w:t>
+              <w:t xml:space="preserve">Heat of combustion：      </w:t>
             </w:r>
           </w:p>
         </w:tc>
@@ -10603,7 +9904,7 @@
                 <w:sz w:val="24"/>
                 <w:lang w:val="en-US" w:eastAsia="zh-CN"/>
               </w:rPr>
-              <w:t xml:space="preserve">pressure: </w:t>
+              <w:t>pressure：</w:t>
             </w:r>
           </w:p>
         </w:tc>
@@ -10739,7 +10040,7 @@
                 <w:sz w:val="24"/>
                 <w:lang w:val="en-US" w:eastAsia="zh-CN"/>
               </w:rPr>
-              <w:t xml:space="preserve">Relative vapour density: </w:t>
+              <w:t>Relative vapour density：</w:t>
             </w:r>
           </w:p>
         </w:tc>
@@ -10875,7 +10176,7 @@
                 <w:sz w:val="24"/>
                 <w:lang w:val="en-US" w:eastAsia="zh-CN"/>
               </w:rPr>
-              <w:t xml:space="preserve">Density:    </w:t>
+              <w:t xml:space="preserve">Density：   </w:t>
             </w:r>
           </w:p>
         </w:tc>
@@ -11013,7 +10314,7 @@
                 <w:sz w:val="24"/>
                 <w:lang w:val="en-US" w:eastAsia="zh-CN"/>
               </w:rPr>
-              <w:t xml:space="preserve">Solubility in water: </w:t>
+              <w:t>Solubility in water：</w:t>
             </w:r>
           </w:p>
         </w:tc>
@@ -11149,7 +10450,7 @@
                 <w:sz w:val="24"/>
                 <w:lang w:val="en-US" w:eastAsia="zh-CN"/>
               </w:rPr>
-              <w:t xml:space="preserve">Surface tension:   </w:t>
+              <w:t xml:space="preserve">Surface tension：  </w:t>
             </w:r>
           </w:p>
         </w:tc>
@@ -11325,7 +10626,7 @@
                 <w:sz w:val="24"/>
                 <w:lang w:val="en-US" w:eastAsia="zh-CN"/>
               </w:rPr>
-              <w:t xml:space="preserve">partition coefficient): </w:t>
+              <w:t>partition coefficient)：</w:t>
             </w:r>
           </w:p>
         </w:tc>
@@ -11503,7 +10804,7 @@
                 <w:sz w:val="24"/>
                 <w:lang w:val="en-US" w:eastAsia="zh-CN"/>
               </w:rPr>
-              <w:t xml:space="preserve">temperature: </w:t>
+              <w:t>temperature：</w:t>
             </w:r>
           </w:p>
         </w:tc>
@@ -11640,7 +10941,7 @@
                 <w:sz w:val="24"/>
                 <w:lang w:val="en-US" w:eastAsia="zh-CN"/>
               </w:rPr>
-              <w:t xml:space="preserve">Ignition temperature: </w:t>
+              <w:t>Ignition temperature：</w:t>
             </w:r>
           </w:p>
         </w:tc>
@@ -11820,7 +11121,7 @@
                 <w:sz w:val="24"/>
                 <w:lang w:val="en-US" w:eastAsia="zh-CN"/>
               </w:rPr>
-              <w:t xml:space="preserve">temperature: </w:t>
+              <w:t>temperature：</w:t>
             </w:r>
           </w:p>
         </w:tc>
@@ -11960,7 +11261,7 @@
                 <w:sz w:val="24"/>
                 <w:lang w:val="en-US" w:eastAsia="zh-CN"/>
               </w:rPr>
-              <w:t xml:space="preserve">Dynamic viscosity: </w:t>
+              <w:t>Dynamic viscosity：</w:t>
             </w:r>
           </w:p>
         </w:tc>
@@ -12096,7 +11397,7 @@
                 <w:sz w:val="24"/>
                 <w:lang w:val="en-US" w:eastAsia="zh-CN"/>
               </w:rPr>
-              <w:t xml:space="preserve">Explosive properties: </w:t>
+              <w:t>Explosive properties：</w:t>
             </w:r>
           </w:p>
         </w:tc>
@@ -12232,7 +11533,7 @@
                 <w:sz w:val="24"/>
                 <w:lang w:val="en-US" w:eastAsia="zh-CN"/>
               </w:rPr>
-              <w:t xml:space="preserve">Dust explosion class: </w:t>
+              <w:t>Dust explosion class：</w:t>
             </w:r>
           </w:p>
         </w:tc>
@@ -12368,7 +11669,7 @@
                 <w:sz w:val="24"/>
                 <w:lang w:val="en-US" w:eastAsia="zh-CN"/>
               </w:rPr>
-              <w:t xml:space="preserve">Solid content: </w:t>
+              <w:t>Solid content：</w:t>
             </w:r>
           </w:p>
         </w:tc>
@@ -12504,7 +11805,7 @@
                 <w:sz w:val="24"/>
                 <w:lang w:val="en-US" w:eastAsia="zh-CN"/>
               </w:rPr>
-              <w:t xml:space="preserve">Other information: </w:t>
+              <w:t>Other information：</w:t>
             </w:r>
           </w:p>
         </w:tc>
@@ -12738,7 +12039,7 @@
                 <w:b/>
                 <w:sz w:val="24"/>
               </w:rPr>
-              <w:t xml:space="preserve">Chemical stability: </w:t>
+              <w:t>Chemical stability：</w:t>
             </w:r>
           </w:p>
         </w:tc>
@@ -12874,7 +12175,7 @@
                 <w:b/>
                 <w:sz w:val="24"/>
               </w:rPr>
-              <w:t xml:space="preserve">Hazardous decomposition products: </w:t>
+              <w:t>Hazardous decomposition products：</w:t>
             </w:r>
           </w:p>
         </w:tc>
@@ -13011,7 +12312,7 @@
                 <w:b/>
                 <w:sz w:val="24"/>
               </w:rPr>
-              <w:t xml:space="preserve">Possible hazardous reactions: </w:t>
+              <w:t>Possible hazardous reactions：</w:t>
             </w:r>
           </w:p>
         </w:tc>
@@ -13160,7 +12461,7 @@
                 <w:b/>
                 <w:sz w:val="24"/>
               </w:rPr>
-              <w:t xml:space="preserve">: </w:t>
+              <w:t>：</w:t>
             </w:r>
           </w:p>
         </w:tc>
@@ -13304,7 +12605,7 @@
                 <w:sz w:val="24"/>
                 <w:lang w:val="en-US" w:eastAsia="zh-CN"/>
               </w:rPr>
-              <w:t xml:space="preserve">Incompatible materials: </w:t>
+              <w:t>Incompatible materials：</w:t>
             </w:r>
           </w:p>
         </w:tc>
@@ -13400,6 +12701,12 @@
             <w:insideH w:val="none" w:color="auto" w:sz="0" w:space="0"/>
             <w:insideV w:val="none" w:color="auto" w:sz="0" w:space="0"/>
           </w:tblBorders>
+          <w:tblCellMar>
+            <w:top w:w="0" w:type="dxa"/>
+            <w:left w:w="108" w:type="dxa"/>
+            <w:bottom w:w="0" w:type="dxa"/>
+            <w:right w:w="108" w:type="dxa"/>
+          </w:tblCellMar>
         </w:tblPrEx>
         <w:trPr>
           <w:cantSplit/>
@@ -13446,7 +12753,7 @@
                 <w:b/>
                 <w:sz w:val="24"/>
               </w:rPr>
-              <w:t xml:space="preserve"> Toxicological information</w:t>
+              <w:t>Toxicity information</w:t>
             </w:r>
           </w:p>
         </w:tc>
@@ -13665,7 +12972,7 @@
                 <w:b/>
                 <w:sz w:val="24"/>
               </w:rPr>
-              <w:t xml:space="preserve">Acute toxicity: </w:t>
+              <w:t>Acute toxicity：</w:t>
             </w:r>
           </w:p>
         </w:tc>
@@ -14287,7 +13594,7 @@
                 <w:b/>
                 <w:sz w:val="24"/>
               </w:rPr>
-              <w:t xml:space="preserve">Primary skin irritation: </w:t>
+              <w:t>Primary skin irritation：</w:t>
             </w:r>
           </w:p>
         </w:tc>
@@ -14508,7 +13815,7 @@
                 <w:b/>
                 <w:sz w:val="24"/>
               </w:rPr>
-              <w:t xml:space="preserve">Primary eye irritation: </w:t>
+              <w:t>Primary eye irritation：</w:t>
             </w:r>
           </w:p>
         </w:tc>
@@ -14721,7 +14028,7 @@
                 <w:b/>
                 <w:sz w:val="24"/>
               </w:rPr>
-              <w:t xml:space="preserve">Sensitization: </w:t>
+              <w:t>Sensitization：</w:t>
             </w:r>
           </w:p>
         </w:tc>
@@ -14950,7 +14257,7 @@
                 <w:b/>
                 <w:sz w:val="24"/>
               </w:rPr>
-              <w:t xml:space="preserve">Mutagenicity: </w:t>
+              <w:t>Mutagenicity：</w:t>
             </w:r>
           </w:p>
         </w:tc>
@@ -15089,7 +14396,7 @@
                 <w:sz w:val="24"/>
                 <w:lang w:val="en-US" w:eastAsia="zh-CN"/>
               </w:rPr>
-              <w:t xml:space="preserve">Carcinogenicity: </w:t>
+              <w:t>Carcinogenicity：</w:t>
             </w:r>
           </w:p>
         </w:tc>
@@ -15229,7 +14536,7 @@
                 <w:sz w:val="24"/>
                 <w:lang w:val="en-US" w:eastAsia="zh-CN"/>
               </w:rPr>
-              <w:t xml:space="preserve">Reproductive toxicity: </w:t>
+              <w:t>Reproductive toxicity：</w:t>
             </w:r>
           </w:p>
         </w:tc>
@@ -15286,7 +14593,7 @@
                 <w:sz w:val="24"/>
                 <w:lang w:eastAsia="zh-CN"/>
               </w:rPr>
-              <w:t xml:space="preserve">: </w:t>
+              <w:t>：</w:t>
             </w:r>
           </w:p>
         </w:tc>
@@ -15447,7 +14754,7 @@
                 <w:sz w:val="24"/>
                 <w:lang w:eastAsia="zh-CN"/>
               </w:rPr>
-              <w:t xml:space="preserve">: </w:t>
+              <w:t>：</w:t>
             </w:r>
           </w:p>
         </w:tc>
@@ -15606,8 +14913,10 @@
                 <w:sz w:val="24"/>
                 <w:lang w:eastAsia="zh-CN"/>
               </w:rPr>
-              <w:t xml:space="preserve">: </w:t>
-            </w:r>
+              <w:t>：</w:t>
+            </w:r>
+            <w:bookmarkStart w:id="0" w:name="_GoBack"/>
+            <w:bookmarkEnd w:id="0"/>
           </w:p>
         </w:tc>
         <w:tc>
@@ -15817,7 +15126,7 @@
                 <w:sz w:val="24"/>
                 <w:lang w:val="en-US" w:eastAsia="zh-CN"/>
               </w:rPr>
-              <w:t xml:space="preserve">exposure): </w:t>
+              <w:t>exposure)：</w:t>
             </w:r>
           </w:p>
         </w:tc>
@@ -15957,7 +15266,7 @@
                 <w:sz w:val="24"/>
                 <w:lang w:val="en-US" w:eastAsia="zh-CN"/>
               </w:rPr>
-              <w:t xml:space="preserve">Aspiration hazard: </w:t>
+              <w:t>Aspiration hazard：</w:t>
             </w:r>
           </w:p>
         </w:tc>
@@ -16084,7 +15393,7 @@
                 <w:sz w:val="24"/>
                 <w:lang w:val="en-US" w:eastAsia="zh-CN"/>
               </w:rPr>
-              <w:t xml:space="preserve">Additional information: </w:t>
+              <w:t>Additional information：</w:t>
             </w:r>
           </w:p>
         </w:tc>
@@ -16550,7 +15859,7 @@
                 <w:b/>
                 <w:sz w:val="24"/>
               </w:rPr>
-              <w:t xml:space="preserve">Ecotoxicity: </w:t>
+              <w:t>Ecotoxicity：</w:t>
             </w:r>
           </w:p>
         </w:tc>
@@ -16863,7 +16172,7 @@
                 <w:b/>
                 <w:sz w:val="24"/>
               </w:rPr>
-              <w:t xml:space="preserve">degradability: </w:t>
+              <w:t>degradability：</w:t>
             </w:r>
           </w:p>
         </w:tc>
@@ -17043,7 +16352,7 @@
                 <w:b/>
                 <w:sz w:val="24"/>
               </w:rPr>
-              <w:t xml:space="preserve">Other adverse effects: </w:t>
+              <w:t>Other adverse effects：</w:t>
             </w:r>
           </w:p>
         </w:tc>
@@ -17359,7 +16668,7 @@
                 <w:b/>
                 <w:sz w:val="24"/>
               </w:rPr>
-              <w:t xml:space="preserve">Disposal methods: </w:t>
+              <w:t>Disposal methods：</w:t>
             </w:r>
           </w:p>
         </w:tc>
@@ -17619,7 +16928,7 @@
                 <w:b/>
                 <w:sz w:val="24"/>
               </w:rPr>
-              <w:t xml:space="preserve"> Transport information</w:t>
+              <w:t>Transportation information</w:t>
             </w:r>
           </w:p>
         </w:tc>
@@ -17713,7 +17022,7 @@
                 <w:b/>
                 <w:sz w:val="24"/>
               </w:rPr>
-              <w:t xml:space="preserve">Road and rail transport: </w:t>
+              <w:t>Road and rail transport：</w:t>
             </w:r>
           </w:p>
         </w:tc>
@@ -17849,7 +17158,7 @@
                 <w:b/>
                 <w:sz w:val="24"/>
               </w:rPr>
-              <w:t xml:space="preserve">Maritime transport: </w:t>
+              <w:t>Maritime transport：</w:t>
             </w:r>
           </w:p>
         </w:tc>
@@ -17986,7 +17295,7 @@
                 <w:b/>
                 <w:sz w:val="24"/>
               </w:rPr>
-              <w:t xml:space="preserve">Air transport: </w:t>
+              <w:t>Air transport：</w:t>
             </w:r>
           </w:p>
         </w:tc>
@@ -18123,7 +17432,7 @@
                 <w:b/>
                 <w:sz w:val="24"/>
               </w:rPr>
-              <w:t xml:space="preserve">Special precautions for user: </w:t>
+              <w:t>Special precautions for user：</w:t>
             </w:r>
           </w:p>
         </w:tc>
@@ -18491,7 +17800,7 @@
                 <w:kern w:val="0"/>
                 <w:sz w:val="24"/>
               </w:rPr>
-              <w:t xml:space="preserve">Other provisions: </w:t>
+              <w:t>Other provisions：</w:t>
             </w:r>
           </w:p>
         </w:tc>
@@ -18549,7 +17858,7 @@
                 <w:kern w:val="0"/>
                 <w:sz w:val="24"/>
               </w:rPr>
-              <w:t xml:space="preserve">Complies with the following regulations: </w:t>
+              <w:t>Complies with the following regulations：</w:t>
             </w:r>
           </w:p>
         </w:tc>
@@ -19096,7 +18405,15 @@
         </w:tc>
       </w:tr>
     </w:tbl>
-    <w:p/>
+    <w:p>
+      <w:pPr>
+        <w:spacing w:before="0" w:after="0" w:line="20" w:lineRule="exact"/>
+        <w:rPr>
+          <w:sz w:val="2"/>
+          <w:szCs w:val="2"/>
+        </w:rPr>
+      </w:pPr>
+    </w:p>
     <w:sectPr>
       <w:headerReference r:id="rId5" w:type="first"/>
       <w:footerReference r:id="rId8" w:type="first"/>
@@ -19445,7 +18762,16 @@
         <w:sz w:val="36"/>
         <w:szCs w:val="36"/>
       </w:rPr>
-      <w:t xml:space="preserve"> SAFETY DATA SHEET</w:t>
+      <w:t xml:space="preserve"> </w:t>
+    </w:r>
+    <w:r>
+      <w:rPr>
+        <w:rFonts w:hint="eastAsia" w:cs="Arial" w:asciiTheme="majorEastAsia" w:hAnsiTheme="majorEastAsia" w:eastAsiaTheme="majorEastAsia"/>
+        <w:b/>
+        <w:sz w:val="44"/>
+        <w:szCs w:val="44"/>
+      </w:rPr>
+      <w:t>物料安全数据表</w:t>
     </w:r>
   </w:p>
   <w:p>
@@ -19465,7 +18791,16 @@
         <w:sz w:val="18"/>
         <w:szCs w:val="18"/>
       </w:rPr>
-      <w:t>Version: 1.0</w:t>
+      <w:t>Version：V1.</w:t>
+    </w:r>
+    <w:r>
+      <w:rPr>
+        <w:rFonts w:hint="eastAsia" w:ascii="Arial" w:eastAsia="楷体_GB2312"/>
+        <w:sz w:val="18"/>
+        <w:szCs w:val="18"/>
+        <w:lang w:val="en-US" w:eastAsia="zh-CN"/>
+      </w:rPr>
+      <w:t>0</w:t>
     </w:r>
   </w:p>
   <w:tbl>

</xml_diff>